<commit_message>
Finalise le script et régénère le rapport carcasse enrichi.
Complète quelques paragraphes du chapitre 3 et resynchronise le Word.

Co-authored-by: progirix <progirix@users.noreply.github.com>
</commit_message>
<xml_diff>
--- a/docs/Rapport_Cylentic_Carcasse_Chapitre3.docx
+++ b/docs/Rapport_Cylentic_Carcasse_Chapitre3.docx
@@ -2116,6 +2116,22 @@
     </w:p>
     <w:p>
       <w:pPr>
+        <w:spacing w:after="160" w:before="0" w:line="360" w:lineRule="auto"/>
+        <w:ind w:firstLine="425"/>
+        <w:jc w:val="both"/>
+      </w:pPr>
+      <w:r>
+        <w:rPr>
+          <w:rFonts w:ascii="Times New Roman" w:hAnsi="Times New Roman" w:eastAsia="Times New Roman"/>
+          <w:b w:val="0"/>
+          <w:i w:val="0"/>
+          <w:sz w:val="24"/>
+        </w:rPr>
+        <w:t>Nous avons aussi refusé deux dérives fréquentes. La première consiste à produire des diagrammes décoratifs, trop génériques pour guider le code. La seconde consiste à coller le schéma de base de données tel quel et à l'appeler conception. Ici, chaque figure a un rôle dans le raisonnement : expliquer une responsabilité, une contrainte ou un enchaînement critique du MVP.</w:t>
+      </w:r>
+    </w:p>
+    <w:p>
+      <w:pPr>
         <w:pStyle w:val="Heading2"/>
         <w:keepNext/>
         <w:spacing w:before="200" w:after="200" w:line="360" w:lineRule="auto"/>
@@ -2161,6 +2177,22 @@
           <w:sz w:val="24"/>
         </w:rPr>
         <w:t>Côté client, l'étudiant compose dans le navigateur avec l'éditeur Monaco. Les contrôles de passation (plein écran, visibilité d'onglet, garde du presse papiers, verrouillage clavier) vivent dans des hooks dédiés. Côté serveur, la logique métier est séparée des routes : authentification, examens, participation, correction et sandbox forment des services distincts. Deux workers complètent le tableau : un pour la correction en file, un pour les transitions de statut d'examen.</w:t>
+      </w:r>
+    </w:p>
+    <w:p>
+      <w:pPr>
+        <w:spacing w:after="160" w:before="0" w:line="360" w:lineRule="auto"/>
+        <w:ind w:firstLine="425"/>
+        <w:jc w:val="both"/>
+      </w:pPr>
+      <w:r>
+        <w:rPr>
+          <w:rFonts w:ascii="Times New Roman" w:hAnsi="Times New Roman" w:eastAsia="Times New Roman"/>
+          <w:b w:val="0"/>
+          <w:i w:val="0"/>
+          <w:sz w:val="24"/>
+        </w:rPr>
+        <w:t>Le choix d'une application monolithique modulaire pour le MVP n'interdit pas une évolution ultérieure. Il fixe surtout une priorité : le jour J, un professeur doit pouvoir publier un examen, un étudiant doit pouvoir composer, et une copie doit pouvoir être corrigée sans dépendre d'une nuée de microservices encore fragiles. Les frontières internes (pages, API, services, persistance) préparent néanmoins une séparation plus nette si la charge ou l'équipe grandit.</w:t>
       </w:r>
     </w:p>
     <w:p>
@@ -4440,6 +4472,22 @@
           <w:sz w:val="24"/>
         </w:rPr>
         <w:t>Côté serveur, l'authentification s'appuie sur des jetons JWT en cookie httpOnly, un middleware de contrôle des espaces par rôle, une limitation des tentatives de connexion et un contrôle du code d'examen. Ces mécanismes complètent la surveillance navigateur sans s'y substituer.</w:t>
+      </w:r>
+    </w:p>
+    <w:p>
+      <w:pPr>
+        <w:spacing w:after="160" w:before="0" w:line="360" w:lineRule="auto"/>
+        <w:ind w:firstLine="425"/>
+        <w:jc w:val="both"/>
+      </w:pPr>
+      <w:r>
+        <w:rPr>
+          <w:rFonts w:ascii="Times New Roman" w:hAnsi="Times New Roman" w:eastAsia="Times New Roman"/>
+          <w:b w:val="0"/>
+          <w:i w:val="0"/>
+          <w:sz w:val="24"/>
+        </w:rPr>
+        <w:t>Dans une salle burkinabè typique, cette conception se lit concrètement. Le surveillant circule, le navigateur enferme la session, le serveur garde l'heure et les preuves. Si le réseau vacille brièvement, les sauvegardes automatiques et la reprise de participation réduisent la perte de travail. Le système ne promet pas une invulnérabilité. Il promet une passation plus traçable qu'une session libre sur un poste partagé.</w:t>
       </w:r>
     </w:p>
     <w:p>

</xml_diff>

<commit_message>
Intègre le travail corrigé de la personne A dans le rapport final.
Remplace résumé, abstract, introduction, chapitres 1 et 2 ; aligne le
texte sur le dépôt réel (sandbox, Super Admin) sans régénérer le document.

Co-authored-by: progirix <progirix@users.noreply.github.com>
</commit_message>
<xml_diff>
--- a/docs/Rapport_Cylentic_Carcasse_Chapitre3.docx
+++ b/docs/Rapport_Cylentic_Carcasse_Chapitre3.docx
@@ -511,7 +511,7 @@
     </w:p>
     <w:p>
       <w:pPr>
-        <w:spacing w:after="80" w:before="0" w:line="360" w:lineRule="auto"/>
+        <w:spacing w:after="60" w:line="360" w:lineRule="auto"/>
         <w:jc w:val="left"/>
       </w:pPr>
       <w:r>
@@ -521,7 +521,7 @@
           <w:i w:val="0"/>
           <w:sz w:val="24"/>
         </w:rPr>
-        <w:t>Résumé</w:t>
+        <w:t>Tableau 1.1 : Comparaison des solutions existantes et de Cylentic</w:t>
       </w:r>
     </w:p>
     <w:p>
@@ -536,13 +536,14 @@
           <w:i w:val="0"/>
           <w:sz w:val="24"/>
         </w:rPr>
-        <w:t>Abstract</w:t>
-      </w:r>
-    </w:p>
-    <w:p>
-      <w:pPr>
-        <w:spacing w:after="80" w:before="0" w:line="360" w:lineRule="auto"/>
-        <w:jc w:val="left"/>
+        <w:t>Résumé</w:t>
+      </w:r>
+    </w:p>
+    <w:p>
+      <w:pPr>
+        <w:spacing w:after="160" w:line="360" w:lineRule="auto"/>
+        <w:ind w:firstLine="425"/>
+        <w:jc w:val="both"/>
       </w:pPr>
       <w:r>
         <w:rPr>
@@ -551,7 +552,227 @@
           <w:i w:val="0"/>
           <w:sz w:val="24"/>
         </w:rPr>
+        <w:t>L'enseignement de la programmation se heurte aujourd'hui à un problème concret : un étudiant peut obtenir une solution fonctionnelle en peu de temps grâce à un assistant de génération de code, sans que le professeur puisse le démontrer. Cylentic est une plateforme web multi établissement qui permet de composer un examen de programmation dans le navigateur, dans un cadre contrôlé, avec exécution isolée du code Python, journalisation des incidents et correction automatique par tests unitaires.</w:t>
+      </w:r>
+    </w:p>
+    <w:p>
+      <w:pPr>
+        <w:spacing w:after="160" w:line="360" w:lineRule="auto"/>
+        <w:ind w:firstLine="425"/>
+        <w:jc w:val="both"/>
+      </w:pPr>
+      <w:r>
+        <w:rPr>
+          <w:rFonts w:ascii="Times New Roman" w:hAnsi="Times New Roman" w:eastAsia="Times New Roman"/>
+          <w:b w:val="0"/>
+          <w:i w:val="0"/>
+          <w:sz w:val="24"/>
+        </w:rPr>
+        <w:t>Le travail a d'abord porté sur l'existant (plateformes d'apprentissage, LMS, outils de proctoring, sandboxes d'exécution) afin d'identifier l'espace laissé libre, puis sur un cahier des charges borné à un MVP réaliste. Ce MVP couvre Python, la gestion des établissements et des comptes, la création et la publication d'examens, la salle d'attente, l'environnement de composition sécurisé et la correction automatique. Sur cette base, la conception UML et la réalisation technique peuvent s'enchaîner sans ambiguïté de périmètre.</w:t>
+      </w:r>
+    </w:p>
+    <w:p>
+      <w:pPr>
+        <w:spacing w:after="160" w:line="360" w:lineRule="auto"/>
+        <w:jc w:val="both"/>
+      </w:pPr>
+      <w:r>
+        <w:rPr>
+          <w:rFonts w:ascii="Times New Roman" w:hAnsi="Times New Roman" w:eastAsia="Times New Roman"/>
+          <w:b w:val="0"/>
+          <w:i w:val="0"/>
+          <w:sz w:val="24"/>
+        </w:rPr>
+        <w:t>Mots clés : examen de programmation, sécurité navigateur, correction automatique, sandbox, plateforme web, UML.</w:t>
+      </w:r>
+    </w:p>
+    <w:p>
+      <w:pPr>
+        <w:spacing w:after="80" w:before="0" w:line="360" w:lineRule="auto"/>
+        <w:jc w:val="left"/>
+      </w:pPr>
+      <w:r>
+        <w:rPr>
+          <w:rFonts w:ascii="Times New Roman" w:hAnsi="Times New Roman" w:eastAsia="Times New Roman"/>
+          <w:b w:val="0"/>
+          <w:i w:val="0"/>
+          <w:sz w:val="24"/>
+        </w:rPr>
+        <w:t>Abstract</w:t>
+      </w:r>
+    </w:p>
+    <w:p>
+      <w:pPr>
+        <w:spacing w:after="160" w:line="360" w:lineRule="auto"/>
+        <w:ind w:firstLine="425"/>
+        <w:jc w:val="both"/>
+      </w:pPr>
+      <w:r>
+        <w:rPr>
+          <w:rFonts w:ascii="Times New Roman" w:hAnsi="Times New Roman" w:eastAsia="Times New Roman"/>
+          <w:b w:val="0"/>
+          <w:i w:val="0"/>
+          <w:sz w:val="24"/>
+        </w:rPr>
+        <w:t>Teaching computer programming today faces a concrete problem: a student can obtain a working solution quickly with a code generation assistant, without the instructor being able to prove it. Cylentic is a multi tenant web platform for taking a programming exam in the browser under controlled conditions, with isolated Python execution, incident logging and automatic grading through unit tests.</w:t>
+      </w:r>
+    </w:p>
+    <w:p>
+      <w:pPr>
+        <w:spacing w:after="160" w:line="360" w:lineRule="auto"/>
+        <w:ind w:firstLine="425"/>
+        <w:jc w:val="both"/>
+      </w:pPr>
+      <w:r>
+        <w:rPr>
+          <w:rFonts w:ascii="Times New Roman" w:hAnsi="Times New Roman" w:eastAsia="Times New Roman"/>
+          <w:b w:val="0"/>
+          <w:i w:val="0"/>
+          <w:sz w:val="24"/>
+        </w:rPr>
+        <w:t>The project first reviewed existing tools (learning platforms, LMS, proctoring products, execution sandboxes) to locate the remaining gap, then defined a realistic MVP. This MVP covers Python, multi institution management, exam creation and publication, a waiting room, a secured composition environment and automatic grading. This foundation supports the UML design and the technical implementation that follow.</w:t>
+      </w:r>
+    </w:p>
+    <w:p>
+      <w:pPr>
+        <w:spacing w:after="160" w:line="360" w:lineRule="auto"/>
+        <w:jc w:val="both"/>
+      </w:pPr>
+      <w:r>
+        <w:rPr>
+          <w:rFonts w:ascii="Times New Roman" w:hAnsi="Times New Roman" w:eastAsia="Times New Roman"/>
+          <w:b w:val="0"/>
+          <w:i w:val="0"/>
+          <w:sz w:val="24"/>
+        </w:rPr>
+        <w:t>Keywords: programming exam, browser security, automatic grading, sandbox, web platform, UML.</w:t>
+      </w:r>
+    </w:p>
+    <w:p>
+      <w:pPr>
+        <w:spacing w:after="80" w:before="0" w:line="360" w:lineRule="auto"/>
+        <w:jc w:val="left"/>
+      </w:pPr>
+      <w:r>
+        <w:rPr>
+          <w:rFonts w:ascii="Times New Roman" w:hAnsi="Times New Roman" w:eastAsia="Times New Roman"/>
+          <w:b w:val="0"/>
+          <w:i w:val="0"/>
+          <w:sz w:val="24"/>
+        </w:rPr>
         <w:t>Introduction générale</w:t>
+      </w:r>
+    </w:p>
+    <w:p>
+      <w:pPr>
+        <w:spacing w:after="160" w:line="360" w:lineRule="auto"/>
+        <w:ind w:firstLine="425"/>
+        <w:jc w:val="both"/>
+      </w:pPr>
+      <w:r>
+        <w:rPr>
+          <w:rFonts w:ascii="Times New Roman" w:hAnsi="Times New Roman" w:eastAsia="Times New Roman"/>
+          <w:b w:val="0"/>
+          <w:i w:val="0"/>
+          <w:sz w:val="24"/>
+        </w:rPr>
+        <w:t>L'enseignement de la programmation repose depuis longtemps sur des exercices et des devoirs que l'étudiant réalise hors de la salle. Cette pratique vise à vérifier qu'il sait construire une solution, la tester et la corriger. Aujourd'hui, cette vérification est fragilisée par la généralisation des assistants de génération de code. Un étudiant peut obtenir rapidement un programme plausible, sans avoir conçu ni maîtrisé la solution. Dans bien des cas, le professeur ne dispose d'aucun moyen fiable pour distinguer un travail réellement produit d'un travail fortement assisté.</w:t>
+      </w:r>
+    </w:p>
+    <w:p>
+      <w:pPr>
+        <w:spacing w:after="160" w:line="360" w:lineRule="auto"/>
+        <w:ind w:firstLine="425"/>
+        <w:jc w:val="both"/>
+      </w:pPr>
+      <w:r>
+        <w:rPr>
+          <w:rFonts w:ascii="Times New Roman" w:hAnsi="Times New Roman" w:eastAsia="Times New Roman"/>
+          <w:b w:val="0"/>
+          <w:i w:val="0"/>
+          <w:sz w:val="24"/>
+        </w:rPr>
+        <w:t>Face à ce constat, certains établissements reviennent aux examens papier. Cela réduit une partie de l'aide externe, mais crée un décalage pédagogique : dans le métier, on n'écrit pas du code au stylo. On utilise un éditeur, on exécute, on lit les erreurs et on corrige. Évaluer surtout la syntaxe sur feuille ne mesure plus la compétence recherchée, à savoir résoudre un problème sur machine.</w:t>
+      </w:r>
+    </w:p>
+    <w:p>
+      <w:pPr>
+        <w:spacing w:after="160" w:line="360" w:lineRule="auto"/>
+        <w:ind w:firstLine="425"/>
+        <w:jc w:val="both"/>
+      </w:pPr>
+      <w:r>
+        <w:rPr>
+          <w:rFonts w:ascii="Times New Roman" w:hAnsi="Times New Roman" w:eastAsia="Times New Roman"/>
+          <w:b w:val="0"/>
+          <w:i w:val="0"/>
+          <w:sz w:val="24"/>
+        </w:rPr>
+        <w:t>Ce travail s'inscrit dans une école d'ingénieurs au Burkina Faso, en filière informatique. Les examens s'y déroulent le plus souvent en salle informatique, sur des postes partagés, avec une qualité de connexion variable. Une solution adaptée doit rester simple à déployer, fonctionner dans le navigateur, sans installation lourde, et tolérer des coupures réseau ponctuelles.</w:t>
+      </w:r>
+    </w:p>
+    <w:p>
+      <w:pPr>
+        <w:spacing w:after="160" w:line="360" w:lineRule="auto"/>
+        <w:ind w:firstLine="425"/>
+        <w:jc w:val="both"/>
+      </w:pPr>
+      <w:r>
+        <w:rPr>
+          <w:rFonts w:ascii="Times New Roman" w:hAnsi="Times New Roman" w:eastAsia="Times New Roman"/>
+          <w:b w:val="0"/>
+          <w:i w:val="0"/>
+          <w:sz w:val="24"/>
+        </w:rPr>
+        <w:t>La question structurante du rapport peut se formuler ainsi : comment permettre à un étudiant de composer un examen de programmation sur ordinateur, tout en réduisant fortement les possibilités de triche, et en donnant au professeur des preuves exploitables en cas d'incident ?</w:t>
+      </w:r>
+    </w:p>
+    <w:p>
+      <w:pPr>
+        <w:spacing w:after="160" w:line="360" w:lineRule="auto"/>
+        <w:ind w:firstLine="425"/>
+        <w:jc w:val="both"/>
+      </w:pPr>
+      <w:r>
+        <w:rPr>
+          <w:rFonts w:ascii="Times New Roman" w:hAnsi="Times New Roman" w:eastAsia="Times New Roman"/>
+          <w:b w:val="0"/>
+          <w:i w:val="0"/>
+          <w:sz w:val="24"/>
+        </w:rPr>
+        <w:t>L'objectif général est de concevoir et de réaliser une plateforme web d'examens de programmation sécurisés, nommée Cylentic. Les objectifs spécifiques sont les suivants : permettre à un établissement de gérer ses comptes et ses classes, permettre à un professeur de créer et de publier un examen, enfermer l'étudiant dans un environnement de composition contrôlé, exécuter son code de façon isolée, corriger automatiquement les exercices à l'aide de tests unitaires, et produire un journal d'incidents exploitable.</w:t>
+      </w:r>
+    </w:p>
+    <w:p>
+      <w:pPr>
+        <w:spacing w:after="160" w:line="360" w:lineRule="auto"/>
+        <w:ind w:firstLine="425"/>
+        <w:jc w:val="both"/>
+      </w:pPr>
+      <w:r>
+        <w:rPr>
+          <w:rFonts w:ascii="Times New Roman" w:hAnsi="Times New Roman" w:eastAsia="Times New Roman"/>
+          <w:b w:val="0"/>
+          <w:i w:val="0"/>
+          <w:sz w:val="24"/>
+        </w:rPr>
+        <w:t>La méthode a consisté à étudier d'abord les solutions existantes afin d'identifier ce qu'elles couvrent et ce qu'elles laissent de côté, puis à spécifier un cahier des charges limité à un MVP réaliste, avant de concevoir le système en UML et de le développer.</w:t>
+      </w:r>
+    </w:p>
+    <w:p>
+      <w:pPr>
+        <w:spacing w:after="160" w:line="360" w:lineRule="auto"/>
+        <w:ind w:firstLine="425"/>
+        <w:jc w:val="both"/>
+      </w:pPr>
+      <w:r>
+        <w:rPr>
+          <w:rFonts w:ascii="Times New Roman" w:hAnsi="Times New Roman" w:eastAsia="Times New Roman"/>
+          <w:b w:val="0"/>
+          <w:i w:val="0"/>
+          <w:sz w:val="24"/>
+        </w:rPr>
+        <w:t>Le rapport s'organise en cinq chapitres. Le premier présente le contexte, la problématique, les objectifs et l'état de l'art. Le deuxième formalise les besoins et le cahier des charges. Le troisième développe la conception du système. Le quatrième décrit la réalisation. Le cinquième discute les tests, les limites et les perspectives. Une conclusion générale ferme le propos.</w:t>
       </w:r>
     </w:p>
     <w:p>
@@ -1576,17 +1797,66 @@
     </w:p>
     <w:p>
       <w:pPr>
-        <w:spacing w:after="120" w:before="0" w:line="360" w:lineRule="auto"/>
-        <w:jc w:val="left"/>
+        <w:spacing w:after="160" w:line="360" w:lineRule="auto"/>
+        <w:ind w:firstLine="425"/>
+        <w:jc w:val="both"/>
       </w:pPr>
       <w:r>
         <w:rPr>
           <w:rFonts w:ascii="Times New Roman" w:hAnsi="Times New Roman" w:eastAsia="Times New Roman"/>
           <w:b w:val="0"/>
-          <w:i/>
+          <w:i w:val="0"/>
           <w:sz w:val="24"/>
         </w:rPr>
-        <w:t>[Contenu du point 1.1 à coller ici]</w:t>
+        <w:t>Dans une formation en informatique, les devoirs et exercices de programmation occupent une place centrale. Ils ne servent pas uniquement à vérifier qu'un étudiant connaît la syntaxe d'un langage : ils mesurent sa capacité à analyser un problème, à le décomposer, à écrire une solution, à la tester, à interpréter les erreurs d'exécution et à corriger son code jusqu'à un résultat correct. Cette compétence pratique ne peut être évaluée de façon fiable qu'en observant l'étudiant produire réellement du code sur une machine.</w:t>
+      </w:r>
+    </w:p>
+    <w:p>
+      <w:pPr>
+        <w:spacing w:after="160" w:line="360" w:lineRule="auto"/>
+        <w:ind w:firstLine="425"/>
+        <w:jc w:val="both"/>
+      </w:pPr>
+      <w:r>
+        <w:rPr>
+          <w:rFonts w:ascii="Times New Roman" w:hAnsi="Times New Roman" w:eastAsia="Times New Roman"/>
+          <w:b w:val="0"/>
+          <w:i w:val="0"/>
+          <w:sz w:val="24"/>
+        </w:rPr>
+        <w:t>C'est précisément cette différence qui distingue une évaluation sur machine d'une évaluation sur papier. Réciter une syntaxe sur une feuille demande de mémoriser la forme d'une instruction, sans jamais vérifier que le programme s'exécute. Un étudiant peut ainsi réussir en connaissant des structures de code, sans être capable de faire fonctionner un vrai programme face à un interpréteur. L'examen papier évalue donc une compétence voisine, mais pas la même : il ne mesure ni la capacité à faire tourner du code, ni celle de lire un message d'erreur, ni celle de déboguer.</w:t>
+      </w:r>
+    </w:p>
+    <w:p>
+      <w:pPr>
+        <w:spacing w:after="160" w:line="360" w:lineRule="auto"/>
+        <w:ind w:firstLine="425"/>
+        <w:jc w:val="both"/>
+      </w:pPr>
+      <w:r>
+        <w:rPr>
+          <w:rFonts w:ascii="Times New Roman" w:hAnsi="Times New Roman" w:eastAsia="Times New Roman"/>
+          <w:b w:val="0"/>
+          <w:i w:val="0"/>
+          <w:sz w:val="24"/>
+        </w:rPr>
+        <w:t>Ce contexte a été transformé ces dernières années par la démocratisation des outils de génération de code. Des assistants comme ChatGPT ou Copilot permettent de décrire un problème en langage naturel et d'obtenir rapidement un programme plausible. Ces outils ont changé la nature des devoirs faits à la maison : un rendu individuel de qualité ne garantit plus que l'étudiant maîtrise la compétence évaluée.</w:t>
+      </w:r>
+    </w:p>
+    <w:p>
+      <w:pPr>
+        <w:spacing w:after="160" w:line="360" w:lineRule="auto"/>
+        <w:ind w:firstLine="425"/>
+        <w:jc w:val="both"/>
+      </w:pPr>
+      <w:r>
+        <w:rPr>
+          <w:rFonts w:ascii="Times New Roman" w:hAnsi="Times New Roman" w:eastAsia="Times New Roman"/>
+          <w:b w:val="0"/>
+          <w:i w:val="0"/>
+          <w:sz w:val="24"/>
+        </w:rPr>
+        <w:t>Le numérique ne remplace pas totalement la surveillance humaine, il la complète. Un surveillant présent en salle reste utile pour observer des comportements que la plateforme ne voit pas, comme l'usage d'un téléphone ou une communication entre étudiants. Cette idée, selon laquelle le numérique appuie l'humain sans s'y substituer, structure une grande partie des choix de Cylentic.</w:t>
       </w:r>
     </w:p>
     <w:p>
@@ -1608,17 +1878,50 @@
     </w:p>
     <w:p>
       <w:pPr>
-        <w:spacing w:after="120" w:before="0" w:line="360" w:lineRule="auto"/>
-        <w:jc w:val="left"/>
+        <w:spacing w:after="160" w:line="360" w:lineRule="auto"/>
+        <w:ind w:firstLine="425"/>
+        <w:jc w:val="both"/>
       </w:pPr>
       <w:r>
         <w:rPr>
           <w:rFonts w:ascii="Times New Roman" w:hAnsi="Times New Roman" w:eastAsia="Times New Roman"/>
           <w:b w:val="0"/>
-          <w:i/>
+          <w:i w:val="0"/>
           <w:sz w:val="24"/>
         </w:rPr>
-        <w:t>[Contenu du point 1.2 à coller ici]</w:t>
+        <w:t>Le problème central peut être formulé nettement : comment permettre à un étudiant de composer un examen de programmation sur ordinateur, tout en réduisant fortement les possibilités de triche, et en donnant au professeur des preuves exploitables en cas d'incident ?</w:t>
+      </w:r>
+    </w:p>
+    <w:p>
+      <w:pPr>
+        <w:spacing w:after="160" w:line="360" w:lineRule="auto"/>
+        <w:ind w:firstLine="425"/>
+        <w:jc w:val="both"/>
+      </w:pPr>
+      <w:r>
+        <w:rPr>
+          <w:rFonts w:ascii="Times New Roman" w:hAnsi="Times New Roman" w:eastAsia="Times New Roman"/>
+          <w:b w:val="0"/>
+          <w:i w:val="0"/>
+          <w:sz w:val="24"/>
+        </w:rPr>
+        <w:t>Ce problème se découpe en sous problèmes concrets. Le premier concerne le contrôle de l'environnement de composition : empêcher de sortir de la zone d'examen, d'ouvrir un autre onglet ou de coller du contenu préparé. Le deuxième concerne la détection des comportements suspects et une réaction proportionnée. Le troisième concerne la correction, qui doit rester fiable quand plusieurs étudiants soumettent au même moment. Le quatrième concerne la traçabilité : le professeur doit disposer d'un historique précis. Le cinquième concerne les coupures réseau, qui ne doivent pas pénaliser injustement un étudiant.</w:t>
+      </w:r>
+    </w:p>
+    <w:p>
+      <w:pPr>
+        <w:spacing w:after="160" w:line="360" w:lineRule="auto"/>
+        <w:ind w:firstLine="425"/>
+        <w:jc w:val="both"/>
+      </w:pPr>
+      <w:r>
+        <w:rPr>
+          <w:rFonts w:ascii="Times New Roman" w:hAnsi="Times New Roman" w:eastAsia="Times New Roman"/>
+          <w:b w:val="0"/>
+          <w:i w:val="0"/>
+          <w:sz w:val="24"/>
+        </w:rPr>
+        <w:t>Dans le contexte burkinabè visé, les examens se déroulent en salle informatique, sur des machines partagées, avec une qualité de connexion variable. La solution recherchée doit donc être simple à déployer et à utiliser le jour J, sans configuration complexe, tout en restant tolérante aux incidents réseau ponctuels.</w:t>
       </w:r>
     </w:p>
     <w:p>
@@ -1640,17 +1943,50 @@
     </w:p>
     <w:p>
       <w:pPr>
-        <w:spacing w:after="120" w:before="0" w:line="360" w:lineRule="auto"/>
-        <w:jc w:val="left"/>
+        <w:spacing w:after="160" w:line="360" w:lineRule="auto"/>
+        <w:ind w:firstLine="425"/>
+        <w:jc w:val="both"/>
       </w:pPr>
       <w:r>
         <w:rPr>
           <w:rFonts w:ascii="Times New Roman" w:hAnsi="Times New Roman" w:eastAsia="Times New Roman"/>
           <w:b w:val="0"/>
-          <w:i/>
+          <w:i w:val="0"/>
           <w:sz w:val="24"/>
         </w:rPr>
-        <w:t>[Contenu du point 1.3 à coller ici]</w:t>
+        <w:t>L'objectif général de ce projet est de concevoir et de réaliser une plateforme web d'examens de programmation sécurisés.</w:t>
+      </w:r>
+    </w:p>
+    <w:p>
+      <w:pPr>
+        <w:spacing w:after="160" w:line="360" w:lineRule="auto"/>
+        <w:ind w:firstLine="425"/>
+        <w:jc w:val="both"/>
+      </w:pPr>
+      <w:r>
+        <w:rPr>
+          <w:rFonts w:ascii="Times New Roman" w:hAnsi="Times New Roman" w:eastAsia="Times New Roman"/>
+          <w:b w:val="0"/>
+          <w:i w:val="0"/>
+          <w:sz w:val="24"/>
+        </w:rPr>
+        <w:t>Les objectifs spécifiques sont les suivants : gérer les établissements et les comptes rattachés, permettre au professeur de créer et de publier un examen, enfermer l'étudiant dans un environnement de composition contrôlé pendant l'épreuve, exécuter le code de façon isolée, corriger automatiquement les exercices à l'aide de tests unitaires définis par le professeur, et produire un journal d'incidents exploitable après l'épreuve.</w:t>
+      </w:r>
+    </w:p>
+    <w:p>
+      <w:pPr>
+        <w:spacing w:after="160" w:line="360" w:lineRule="auto"/>
+        <w:ind w:firstLine="425"/>
+        <w:jc w:val="both"/>
+      </w:pPr>
+      <w:r>
+        <w:rPr>
+          <w:rFonts w:ascii="Times New Roman" w:hAnsi="Times New Roman" w:eastAsia="Times New Roman"/>
+          <w:b w:val="0"/>
+          <w:i w:val="0"/>
+          <w:sz w:val="24"/>
+        </w:rPr>
+        <w:t>L'hypothèse de travail retenue est la suivante : si l'on verrouille suffisamment le navigateur de l'étudiant et que l'on journalise systématiquement les événements suspects, alors il devient possible de restaurer une crédibilité utile aux examens pratiques sur machine, sans revenir au papier.</w:t>
       </w:r>
     </w:p>
     <w:p>
@@ -1672,17 +2008,913 @@
     </w:p>
     <w:p>
       <w:pPr>
-        <w:spacing w:after="120" w:before="0" w:line="360" w:lineRule="auto"/>
+        <w:spacing w:after="160" w:line="360" w:lineRule="auto"/>
+        <w:ind w:firstLine="425"/>
+        <w:jc w:val="both"/>
+      </w:pPr>
+      <w:r>
+        <w:rPr>
+          <w:rFonts w:ascii="Times New Roman" w:hAnsi="Times New Roman" w:eastAsia="Times New Roman"/>
+          <w:b w:val="0"/>
+          <w:i w:val="0"/>
+          <w:sz w:val="24"/>
+        </w:rPr>
+        <w:t>Plusieurs catégories de solutions existent déjà et couvrent, chacune partiellement, une partie du problème.</w:t>
+      </w:r>
+    </w:p>
+    <w:p>
+      <w:pPr>
+        <w:spacing w:after="160" w:line="360" w:lineRule="auto"/>
+        <w:ind w:firstLine="425"/>
+        <w:jc w:val="both"/>
+      </w:pPr>
+      <w:r>
+        <w:rPr>
+          <w:rFonts w:ascii="Times New Roman" w:hAnsi="Times New Roman" w:eastAsia="Times New Roman"/>
+          <w:b w:val="0"/>
+          <w:i w:val="0"/>
+          <w:sz w:val="24"/>
+        </w:rPr>
+        <w:t>Les plateformes d'apprentissage en ligne, comme freeCodeCamp, proposent une interface proche de celle recherchée : un énoncé à côté d'un éditeur, avec exécution immédiate. Elles sont conçues pour l'apprentissage libre, non pour l'examen surveillé. Elles ne disposent en général d'aucun verrouillage de session digne d'une épreuve, ni d'un journal d'incidents orienté professeur.</w:t>
+      </w:r>
+    </w:p>
+    <w:p>
+      <w:pPr>
+        <w:spacing w:after="160" w:line="360" w:lineRule="auto"/>
+        <w:ind w:firstLine="425"/>
+        <w:jc w:val="both"/>
+      </w:pPr>
+      <w:r>
+        <w:rPr>
+          <w:rFonts w:ascii="Times New Roman" w:hAnsi="Times New Roman" w:eastAsia="Times New Roman"/>
+          <w:b w:val="0"/>
+          <w:i w:val="0"/>
+          <w:sz w:val="24"/>
+        </w:rPr>
+        <w:t>Les systèmes de gestion de l'apprentissage, dont Moodle est le représentant le plus répandu, permettent de créer des cours, de déposer des devoirs, de gérer des classes et des comptes, et de configurer des créneaux d'examen. Leur module de quiz autorise une correction automatique de questions à choix multiples. Moodle reste cependant généraliste : il ne propose pas nativement un éditeur de code avec exécution isolée, et la surveillance poussée passe souvent par des extensions tierces, parfois coûteuses et lourdes à déployer.</w:t>
+      </w:r>
+    </w:p>
+    <w:p>
+      <w:pPr>
+        <w:spacing w:after="160" w:line="360" w:lineRule="auto"/>
+        <w:ind w:firstLine="425"/>
+        <w:jc w:val="both"/>
+      </w:pPr>
+      <w:r>
+        <w:rPr>
+          <w:rFonts w:ascii="Times New Roman" w:hAnsi="Times New Roman" w:eastAsia="Times New Roman"/>
+          <w:b w:val="0"/>
+          <w:i w:val="0"/>
+          <w:sz w:val="24"/>
+        </w:rPr>
+        <w:t>Les outils de proctoring du marché, fondés sur la webcam, la détection de comportements ou le verrouillage de poste, répondent surtout à la surveillance d'examens généralistes. Leur coût de licence est souvent élevé. Ils ne savent ni exécuter ni corriger du code de programmation dans le sens attendu ici.</w:t>
+      </w:r>
+    </w:p>
+    <w:p>
+      <w:pPr>
+        <w:spacing w:after="160" w:line="360" w:lineRule="auto"/>
+        <w:ind w:firstLine="425"/>
+        <w:jc w:val="both"/>
+      </w:pPr>
+      <w:r>
+        <w:rPr>
+          <w:rFonts w:ascii="Times New Roman" w:hAnsi="Times New Roman" w:eastAsia="Times New Roman"/>
+          <w:b w:val="0"/>
+          <w:i w:val="0"/>
+          <w:sz w:val="24"/>
+        </w:rPr>
+        <w:t>Les sandboxes d'exécution, dont Judge0 est un exemple connu, résolvent un problème ciblé : exécuter du code dans un environnement isolé, sans accès réseau, avec des limites de mémoire et de temps, puis renvoyer la sortie. Ces composants sont utiles et souvent auto hébergeables. Ils ne proposent toutefois ni interface d'examen, ni gestion d'établissements, ni mécanismes de passation contrôlée : ce sont des briques techniques, pas une plateforme d'épreuve.</w:t>
+      </w:r>
+    </w:p>
+    <w:p>
+      <w:pPr>
+        <w:spacing w:after="80" w:line="360" w:lineRule="auto"/>
         <w:jc w:val="left"/>
       </w:pPr>
       <w:r>
         <w:rPr>
           <w:rFonts w:ascii="Times New Roman" w:hAnsi="Times New Roman" w:eastAsia="Times New Roman"/>
+          <w:b/>
+          <w:i w:val="0"/>
+          <w:sz w:val="22"/>
+        </w:rPr>
+        <w:t>Tableau 1.1 : Comparaison des solutions existantes et de Cylentic</w:t>
+      </w:r>
+    </w:p>
+    <w:tbl>
+      <w:tblPr>
+        <w:tblStyle w:val="TableGrid"/>
+        <w:tblW w:type="auto" w:w="0"/>
+        <w:tblLook w:firstColumn="1" w:firstRow="1" w:lastColumn="0" w:lastRow="0" w:noHBand="0" w:noVBand="1" w:val="04A0"/>
+      </w:tblPr>
+      <w:tblGrid>
+        <w:gridCol w:w="1417"/>
+        <w:gridCol w:w="1417"/>
+        <w:gridCol w:w="1417"/>
+        <w:gridCol w:w="1417"/>
+        <w:gridCol w:w="1417"/>
+        <w:gridCol w:w="1417"/>
+      </w:tblGrid>
+      <w:tr>
+        <w:tc>
+          <w:tcPr>
+            <w:tcW w:type="dxa" w:w="1417"/>
+          </w:tcPr>
+          <w:p>
+            <w:r>
+              <w:rPr>
+                <w:rFonts w:ascii="Times New Roman" w:hAnsi="Times New Roman" w:eastAsia="Times New Roman"/>
+                <w:b/>
+                <w:i w:val="0"/>
+                <w:sz w:val="20"/>
+              </w:rPr>
+              <w:t>Critère</w:t>
+            </w:r>
+          </w:p>
+        </w:tc>
+        <w:tc>
+          <w:tcPr>
+            <w:tcW w:type="dxa" w:w="1417"/>
+          </w:tcPr>
+          <w:p>
+            <w:r>
+              <w:rPr>
+                <w:rFonts w:ascii="Times New Roman" w:hAnsi="Times New Roman" w:eastAsia="Times New Roman"/>
+                <w:b/>
+                <w:i w:val="0"/>
+                <w:sz w:val="20"/>
+              </w:rPr>
+              <w:t>freeCodeCamp</w:t>
+            </w:r>
+          </w:p>
+        </w:tc>
+        <w:tc>
+          <w:tcPr>
+            <w:tcW w:type="dxa" w:w="1417"/>
+          </w:tcPr>
+          <w:p>
+            <w:r>
+              <w:rPr>
+                <w:rFonts w:ascii="Times New Roman" w:hAnsi="Times New Roman" w:eastAsia="Times New Roman"/>
+                <w:b/>
+                <w:i w:val="0"/>
+                <w:sz w:val="20"/>
+              </w:rPr>
+              <w:t>Moodle</w:t>
+            </w:r>
+          </w:p>
+        </w:tc>
+        <w:tc>
+          <w:tcPr>
+            <w:tcW w:type="dxa" w:w="1417"/>
+          </w:tcPr>
+          <w:p>
+            <w:r>
+              <w:rPr>
+                <w:rFonts w:ascii="Times New Roman" w:hAnsi="Times New Roman" w:eastAsia="Times New Roman"/>
+                <w:b/>
+                <w:i w:val="0"/>
+                <w:sz w:val="20"/>
+              </w:rPr>
+              <w:t>Proctoring</w:t>
+            </w:r>
+          </w:p>
+        </w:tc>
+        <w:tc>
+          <w:tcPr>
+            <w:tcW w:type="dxa" w:w="1417"/>
+          </w:tcPr>
+          <w:p>
+            <w:r>
+              <w:rPr>
+                <w:rFonts w:ascii="Times New Roman" w:hAnsi="Times New Roman" w:eastAsia="Times New Roman"/>
+                <w:b/>
+                <w:i w:val="0"/>
+                <w:sz w:val="20"/>
+              </w:rPr>
+              <w:t>Sandbox (ex. Judge0)</w:t>
+            </w:r>
+          </w:p>
+        </w:tc>
+        <w:tc>
+          <w:tcPr>
+            <w:tcW w:type="dxa" w:w="1417"/>
+          </w:tcPr>
+          <w:p>
+            <w:r>
+              <w:rPr>
+                <w:rFonts w:ascii="Times New Roman" w:hAnsi="Times New Roman" w:eastAsia="Times New Roman"/>
+                <w:b/>
+                <w:i w:val="0"/>
+                <w:sz w:val="20"/>
+              </w:rPr>
+              <w:t>Cylentic</w:t>
+            </w:r>
+          </w:p>
+        </w:tc>
+      </w:tr>
+      <w:tr>
+        <w:tc>
+          <w:tcPr>
+            <w:tcW w:type="dxa" w:w="1417"/>
+          </w:tcPr>
+          <w:p>
+            <w:r>
+              <w:rPr>
+                <w:rFonts w:ascii="Times New Roman" w:hAnsi="Times New Roman" w:eastAsia="Times New Roman"/>
+                <w:b w:val="0"/>
+                <w:i w:val="0"/>
+                <w:sz w:val="20"/>
+              </w:rPr>
+              <w:t>Exécution de code</w:t>
+            </w:r>
+          </w:p>
+        </w:tc>
+        <w:tc>
+          <w:tcPr>
+            <w:tcW w:type="dxa" w:w="1417"/>
+          </w:tcPr>
+          <w:p>
+            <w:r>
+              <w:rPr>
+                <w:rFonts w:ascii="Times New Roman" w:hAnsi="Times New Roman" w:eastAsia="Times New Roman"/>
+                <w:b w:val="0"/>
+                <w:i w:val="0"/>
+                <w:sz w:val="20"/>
+              </w:rPr>
+              <w:t>Oui</w:t>
+            </w:r>
+          </w:p>
+        </w:tc>
+        <w:tc>
+          <w:tcPr>
+            <w:tcW w:type="dxa" w:w="1417"/>
+          </w:tcPr>
+          <w:p>
+            <w:r>
+              <w:rPr>
+                <w:rFonts w:ascii="Times New Roman" w:hAnsi="Times New Roman" w:eastAsia="Times New Roman"/>
+                <w:b w:val="0"/>
+                <w:i w:val="0"/>
+                <w:sz w:val="20"/>
+              </w:rPr>
+              <w:t>Non</w:t>
+            </w:r>
+          </w:p>
+        </w:tc>
+        <w:tc>
+          <w:tcPr>
+            <w:tcW w:type="dxa" w:w="1417"/>
+          </w:tcPr>
+          <w:p>
+            <w:r>
+              <w:rPr>
+                <w:rFonts w:ascii="Times New Roman" w:hAnsi="Times New Roman" w:eastAsia="Times New Roman"/>
+                <w:b w:val="0"/>
+                <w:i w:val="0"/>
+                <w:sz w:val="20"/>
+              </w:rPr>
+              <w:t>Non</w:t>
+            </w:r>
+          </w:p>
+        </w:tc>
+        <w:tc>
+          <w:tcPr>
+            <w:tcW w:type="dxa" w:w="1417"/>
+          </w:tcPr>
+          <w:p>
+            <w:r>
+              <w:rPr>
+                <w:rFonts w:ascii="Times New Roman" w:hAnsi="Times New Roman" w:eastAsia="Times New Roman"/>
+                <w:b w:val="0"/>
+                <w:i w:val="0"/>
+                <w:sz w:val="20"/>
+              </w:rPr>
+              <w:t>Oui</w:t>
+            </w:r>
+          </w:p>
+        </w:tc>
+        <w:tc>
+          <w:tcPr>
+            <w:tcW w:type="dxa" w:w="1417"/>
+          </w:tcPr>
+          <w:p>
+            <w:r>
+              <w:rPr>
+                <w:rFonts w:ascii="Times New Roman" w:hAnsi="Times New Roman" w:eastAsia="Times New Roman"/>
+                <w:b w:val="0"/>
+                <w:i w:val="0"/>
+                <w:sz w:val="20"/>
+              </w:rPr>
+              <w:t>Oui</w:t>
+            </w:r>
+          </w:p>
+        </w:tc>
+      </w:tr>
+      <w:tr>
+        <w:tc>
+          <w:tcPr>
+            <w:tcW w:type="dxa" w:w="1417"/>
+          </w:tcPr>
+          <w:p>
+            <w:r>
+              <w:rPr>
+                <w:rFonts w:ascii="Times New Roman" w:hAnsi="Times New Roman" w:eastAsia="Times New Roman"/>
+                <w:b w:val="0"/>
+                <w:i w:val="0"/>
+                <w:sz w:val="20"/>
+              </w:rPr>
+              <w:t>Verrouillage de session</w:t>
+            </w:r>
+          </w:p>
+        </w:tc>
+        <w:tc>
+          <w:tcPr>
+            <w:tcW w:type="dxa" w:w="1417"/>
+          </w:tcPr>
+          <w:p>
+            <w:r>
+              <w:rPr>
+                <w:rFonts w:ascii="Times New Roman" w:hAnsi="Times New Roman" w:eastAsia="Times New Roman"/>
+                <w:b w:val="0"/>
+                <w:i w:val="0"/>
+                <w:sz w:val="20"/>
+              </w:rPr>
+              <w:t>Non</w:t>
+            </w:r>
+          </w:p>
+        </w:tc>
+        <w:tc>
+          <w:tcPr>
+            <w:tcW w:type="dxa" w:w="1417"/>
+          </w:tcPr>
+          <w:p>
+            <w:r>
+              <w:rPr>
+                <w:rFonts w:ascii="Times New Roman" w:hAnsi="Times New Roman" w:eastAsia="Times New Roman"/>
+                <w:b w:val="0"/>
+                <w:i w:val="0"/>
+                <w:sz w:val="20"/>
+              </w:rPr>
+              <w:t>Non</w:t>
+            </w:r>
+          </w:p>
+        </w:tc>
+        <w:tc>
+          <w:tcPr>
+            <w:tcW w:type="dxa" w:w="1417"/>
+          </w:tcPr>
+          <w:p>
+            <w:r>
+              <w:rPr>
+                <w:rFonts w:ascii="Times New Roman" w:hAnsi="Times New Roman" w:eastAsia="Times New Roman"/>
+                <w:b w:val="0"/>
+                <w:i w:val="0"/>
+                <w:sz w:val="20"/>
+              </w:rPr>
+              <w:t>Partiel</w:t>
+            </w:r>
+          </w:p>
+        </w:tc>
+        <w:tc>
+          <w:tcPr>
+            <w:tcW w:type="dxa" w:w="1417"/>
+          </w:tcPr>
+          <w:p>
+            <w:r>
+              <w:rPr>
+                <w:rFonts w:ascii="Times New Roman" w:hAnsi="Times New Roman" w:eastAsia="Times New Roman"/>
+                <w:b w:val="0"/>
+                <w:i w:val="0"/>
+                <w:sz w:val="20"/>
+              </w:rPr>
+              <w:t>Non</w:t>
+            </w:r>
+          </w:p>
+        </w:tc>
+        <w:tc>
+          <w:tcPr>
+            <w:tcW w:type="dxa" w:w="1417"/>
+          </w:tcPr>
+          <w:p>
+            <w:r>
+              <w:rPr>
+                <w:rFonts w:ascii="Times New Roman" w:hAnsi="Times New Roman" w:eastAsia="Times New Roman"/>
+                <w:b w:val="0"/>
+                <w:i w:val="0"/>
+                <w:sz w:val="20"/>
+              </w:rPr>
+              <w:t>Oui</w:t>
+            </w:r>
+          </w:p>
+        </w:tc>
+      </w:tr>
+      <w:tr>
+        <w:tc>
+          <w:tcPr>
+            <w:tcW w:type="dxa" w:w="1417"/>
+          </w:tcPr>
+          <w:p>
+            <w:r>
+              <w:rPr>
+                <w:rFonts w:ascii="Times New Roman" w:hAnsi="Times New Roman" w:eastAsia="Times New Roman"/>
+                <w:b w:val="0"/>
+                <w:i w:val="0"/>
+                <w:sz w:val="20"/>
+              </w:rPr>
+              <w:t>Journal d'incidents</w:t>
+            </w:r>
+          </w:p>
+        </w:tc>
+        <w:tc>
+          <w:tcPr>
+            <w:tcW w:type="dxa" w:w="1417"/>
+          </w:tcPr>
+          <w:p>
+            <w:r>
+              <w:rPr>
+                <w:rFonts w:ascii="Times New Roman" w:hAnsi="Times New Roman" w:eastAsia="Times New Roman"/>
+                <w:b w:val="0"/>
+                <w:i w:val="0"/>
+                <w:sz w:val="20"/>
+              </w:rPr>
+              <w:t>Non</w:t>
+            </w:r>
+          </w:p>
+        </w:tc>
+        <w:tc>
+          <w:tcPr>
+            <w:tcW w:type="dxa" w:w="1417"/>
+          </w:tcPr>
+          <w:p>
+            <w:r>
+              <w:rPr>
+                <w:rFonts w:ascii="Times New Roman" w:hAnsi="Times New Roman" w:eastAsia="Times New Roman"/>
+                <w:b w:val="0"/>
+                <w:i w:val="0"/>
+                <w:sz w:val="20"/>
+              </w:rPr>
+              <w:t>Partiel</w:t>
+            </w:r>
+          </w:p>
+        </w:tc>
+        <w:tc>
+          <w:tcPr>
+            <w:tcW w:type="dxa" w:w="1417"/>
+          </w:tcPr>
+          <w:p>
+            <w:r>
+              <w:rPr>
+                <w:rFonts w:ascii="Times New Roman" w:hAnsi="Times New Roman" w:eastAsia="Times New Roman"/>
+                <w:b w:val="0"/>
+                <w:i w:val="0"/>
+                <w:sz w:val="20"/>
+              </w:rPr>
+              <w:t>Oui</w:t>
+            </w:r>
+          </w:p>
+        </w:tc>
+        <w:tc>
+          <w:tcPr>
+            <w:tcW w:type="dxa" w:w="1417"/>
+          </w:tcPr>
+          <w:p>
+            <w:r>
+              <w:rPr>
+                <w:rFonts w:ascii="Times New Roman" w:hAnsi="Times New Roman" w:eastAsia="Times New Roman"/>
+                <w:b w:val="0"/>
+                <w:i w:val="0"/>
+                <w:sz w:val="20"/>
+              </w:rPr>
+              <w:t>Non</w:t>
+            </w:r>
+          </w:p>
+        </w:tc>
+        <w:tc>
+          <w:tcPr>
+            <w:tcW w:type="dxa" w:w="1417"/>
+          </w:tcPr>
+          <w:p>
+            <w:r>
+              <w:rPr>
+                <w:rFonts w:ascii="Times New Roman" w:hAnsi="Times New Roman" w:eastAsia="Times New Roman"/>
+                <w:b w:val="0"/>
+                <w:i w:val="0"/>
+                <w:sz w:val="20"/>
+              </w:rPr>
+              <w:t>Oui</w:t>
+            </w:r>
+          </w:p>
+        </w:tc>
+      </w:tr>
+      <w:tr>
+        <w:tc>
+          <w:tcPr>
+            <w:tcW w:type="dxa" w:w="1417"/>
+          </w:tcPr>
+          <w:p>
+            <w:r>
+              <w:rPr>
+                <w:rFonts w:ascii="Times New Roman" w:hAnsi="Times New Roman" w:eastAsia="Times New Roman"/>
+                <w:b w:val="0"/>
+                <w:i w:val="0"/>
+                <w:sz w:val="20"/>
+              </w:rPr>
+              <w:t>Correction automatique</w:t>
+            </w:r>
+          </w:p>
+        </w:tc>
+        <w:tc>
+          <w:tcPr>
+            <w:tcW w:type="dxa" w:w="1417"/>
+          </w:tcPr>
+          <w:p>
+            <w:r>
+              <w:rPr>
+                <w:rFonts w:ascii="Times New Roman" w:hAnsi="Times New Roman" w:eastAsia="Times New Roman"/>
+                <w:b w:val="0"/>
+                <w:i w:val="0"/>
+                <w:sz w:val="20"/>
+              </w:rPr>
+              <w:t>Partiel</w:t>
+            </w:r>
+          </w:p>
+        </w:tc>
+        <w:tc>
+          <w:tcPr>
+            <w:tcW w:type="dxa" w:w="1417"/>
+          </w:tcPr>
+          <w:p>
+            <w:r>
+              <w:rPr>
+                <w:rFonts w:ascii="Times New Roman" w:hAnsi="Times New Roman" w:eastAsia="Times New Roman"/>
+                <w:b w:val="0"/>
+                <w:i w:val="0"/>
+                <w:sz w:val="20"/>
+              </w:rPr>
+              <w:t>Oui (QCM)</w:t>
+            </w:r>
+          </w:p>
+        </w:tc>
+        <w:tc>
+          <w:tcPr>
+            <w:tcW w:type="dxa" w:w="1417"/>
+          </w:tcPr>
+          <w:p>
+            <w:r>
+              <w:rPr>
+                <w:rFonts w:ascii="Times New Roman" w:hAnsi="Times New Roman" w:eastAsia="Times New Roman"/>
+                <w:b w:val="0"/>
+                <w:i w:val="0"/>
+                <w:sz w:val="20"/>
+              </w:rPr>
+              <w:t>Non</w:t>
+            </w:r>
+          </w:p>
+        </w:tc>
+        <w:tc>
+          <w:tcPr>
+            <w:tcW w:type="dxa" w:w="1417"/>
+          </w:tcPr>
+          <w:p>
+            <w:r>
+              <w:rPr>
+                <w:rFonts w:ascii="Times New Roman" w:hAnsi="Times New Roman" w:eastAsia="Times New Roman"/>
+                <w:b w:val="0"/>
+                <w:i w:val="0"/>
+                <w:sz w:val="20"/>
+              </w:rPr>
+              <w:t>Non</w:t>
+            </w:r>
+          </w:p>
+        </w:tc>
+        <w:tc>
+          <w:tcPr>
+            <w:tcW w:type="dxa" w:w="1417"/>
+          </w:tcPr>
+          <w:p>
+            <w:r>
+              <w:rPr>
+                <w:rFonts w:ascii="Times New Roman" w:hAnsi="Times New Roman" w:eastAsia="Times New Roman"/>
+                <w:b w:val="0"/>
+                <w:i w:val="0"/>
+                <w:sz w:val="20"/>
+              </w:rPr>
+              <w:t>Oui</w:t>
+            </w:r>
+          </w:p>
+        </w:tc>
+      </w:tr>
+      <w:tr>
+        <w:tc>
+          <w:tcPr>
+            <w:tcW w:type="dxa" w:w="1417"/>
+          </w:tcPr>
+          <w:p>
+            <w:r>
+              <w:rPr>
+                <w:rFonts w:ascii="Times New Roman" w:hAnsi="Times New Roman" w:eastAsia="Times New Roman"/>
+                <w:b w:val="0"/>
+                <w:i w:val="0"/>
+                <w:sz w:val="20"/>
+              </w:rPr>
+              <w:t>Multi établissements</w:t>
+            </w:r>
+          </w:p>
+        </w:tc>
+        <w:tc>
+          <w:tcPr>
+            <w:tcW w:type="dxa" w:w="1417"/>
+          </w:tcPr>
+          <w:p>
+            <w:r>
+              <w:rPr>
+                <w:rFonts w:ascii="Times New Roman" w:hAnsi="Times New Roman" w:eastAsia="Times New Roman"/>
+                <w:b w:val="0"/>
+                <w:i w:val="0"/>
+                <w:sz w:val="20"/>
+              </w:rPr>
+              <w:t>Non</w:t>
+            </w:r>
+          </w:p>
+        </w:tc>
+        <w:tc>
+          <w:tcPr>
+            <w:tcW w:type="dxa" w:w="1417"/>
+          </w:tcPr>
+          <w:p>
+            <w:r>
+              <w:rPr>
+                <w:rFonts w:ascii="Times New Roman" w:hAnsi="Times New Roman" w:eastAsia="Times New Roman"/>
+                <w:b w:val="0"/>
+                <w:i w:val="0"/>
+                <w:sz w:val="20"/>
+              </w:rPr>
+              <w:t>Oui</w:t>
+            </w:r>
+          </w:p>
+        </w:tc>
+        <w:tc>
+          <w:tcPr>
+            <w:tcW w:type="dxa" w:w="1417"/>
+          </w:tcPr>
+          <w:p>
+            <w:r>
+              <w:rPr>
+                <w:rFonts w:ascii="Times New Roman" w:hAnsi="Times New Roman" w:eastAsia="Times New Roman"/>
+                <w:b w:val="0"/>
+                <w:i w:val="0"/>
+                <w:sz w:val="20"/>
+              </w:rPr>
+              <w:t>Oui</w:t>
+            </w:r>
+          </w:p>
+        </w:tc>
+        <w:tc>
+          <w:tcPr>
+            <w:tcW w:type="dxa" w:w="1417"/>
+          </w:tcPr>
+          <w:p>
+            <w:r>
+              <w:rPr>
+                <w:rFonts w:ascii="Times New Roman" w:hAnsi="Times New Roman" w:eastAsia="Times New Roman"/>
+                <w:b w:val="0"/>
+                <w:i w:val="0"/>
+                <w:sz w:val="20"/>
+              </w:rPr>
+              <w:t>Non</w:t>
+            </w:r>
+          </w:p>
+        </w:tc>
+        <w:tc>
+          <w:tcPr>
+            <w:tcW w:type="dxa" w:w="1417"/>
+          </w:tcPr>
+          <w:p>
+            <w:r>
+              <w:rPr>
+                <w:rFonts w:ascii="Times New Roman" w:hAnsi="Times New Roman" w:eastAsia="Times New Roman"/>
+                <w:b w:val="0"/>
+                <w:i w:val="0"/>
+                <w:sz w:val="20"/>
+              </w:rPr>
+              <w:t>Oui</w:t>
+            </w:r>
+          </w:p>
+        </w:tc>
+      </w:tr>
+      <w:tr>
+        <w:tc>
+          <w:tcPr>
+            <w:tcW w:type="dxa" w:w="1417"/>
+          </w:tcPr>
+          <w:p>
+            <w:r>
+              <w:rPr>
+                <w:rFonts w:ascii="Times New Roman" w:hAnsi="Times New Roman" w:eastAsia="Times New Roman"/>
+                <w:b w:val="0"/>
+                <w:i w:val="0"/>
+                <w:sz w:val="20"/>
+              </w:rPr>
+              <w:t>Auto hébergement possible</w:t>
+            </w:r>
+          </w:p>
+        </w:tc>
+        <w:tc>
+          <w:tcPr>
+            <w:tcW w:type="dxa" w:w="1417"/>
+          </w:tcPr>
+          <w:p>
+            <w:r>
+              <w:rPr>
+                <w:rFonts w:ascii="Times New Roman" w:hAnsi="Times New Roman" w:eastAsia="Times New Roman"/>
+                <w:b w:val="0"/>
+                <w:i w:val="0"/>
+                <w:sz w:val="20"/>
+              </w:rPr>
+              <w:t>Non</w:t>
+            </w:r>
+          </w:p>
+        </w:tc>
+        <w:tc>
+          <w:tcPr>
+            <w:tcW w:type="dxa" w:w="1417"/>
+          </w:tcPr>
+          <w:p>
+            <w:r>
+              <w:rPr>
+                <w:rFonts w:ascii="Times New Roman" w:hAnsi="Times New Roman" w:eastAsia="Times New Roman"/>
+                <w:b w:val="0"/>
+                <w:i w:val="0"/>
+                <w:sz w:val="20"/>
+              </w:rPr>
+              <w:t>Oui</w:t>
+            </w:r>
+          </w:p>
+        </w:tc>
+        <w:tc>
+          <w:tcPr>
+            <w:tcW w:type="dxa" w:w="1417"/>
+          </w:tcPr>
+          <w:p>
+            <w:r>
+              <w:rPr>
+                <w:rFonts w:ascii="Times New Roman" w:hAnsi="Times New Roman" w:eastAsia="Times New Roman"/>
+                <w:b w:val="0"/>
+                <w:i w:val="0"/>
+                <w:sz w:val="20"/>
+              </w:rPr>
+              <w:t>Non</w:t>
+            </w:r>
+          </w:p>
+        </w:tc>
+        <w:tc>
+          <w:tcPr>
+            <w:tcW w:type="dxa" w:w="1417"/>
+          </w:tcPr>
+          <w:p>
+            <w:r>
+              <w:rPr>
+                <w:rFonts w:ascii="Times New Roman" w:hAnsi="Times New Roman" w:eastAsia="Times New Roman"/>
+                <w:b w:val="0"/>
+                <w:i w:val="0"/>
+                <w:sz w:val="20"/>
+              </w:rPr>
+              <w:t>Oui</w:t>
+            </w:r>
+          </w:p>
+        </w:tc>
+        <w:tc>
+          <w:tcPr>
+            <w:tcW w:type="dxa" w:w="1417"/>
+          </w:tcPr>
+          <w:p>
+            <w:r>
+              <w:rPr>
+                <w:rFonts w:ascii="Times New Roman" w:hAnsi="Times New Roman" w:eastAsia="Times New Roman"/>
+                <w:b w:val="0"/>
+                <w:i w:val="0"/>
+                <w:sz w:val="20"/>
+              </w:rPr>
+              <w:t>Oui</w:t>
+            </w:r>
+          </w:p>
+        </w:tc>
+      </w:tr>
+      <w:tr>
+        <w:tc>
+          <w:tcPr>
+            <w:tcW w:type="dxa" w:w="1417"/>
+          </w:tcPr>
+          <w:p>
+            <w:r>
+              <w:rPr>
+                <w:rFonts w:ascii="Times New Roman" w:hAnsi="Times New Roman" w:eastAsia="Times New Roman"/>
+                <w:b w:val="0"/>
+                <w:i w:val="0"/>
+                <w:sz w:val="20"/>
+              </w:rPr>
+              <w:t>Résilience réseau</w:t>
+            </w:r>
+          </w:p>
+        </w:tc>
+        <w:tc>
+          <w:tcPr>
+            <w:tcW w:type="dxa" w:w="1417"/>
+          </w:tcPr>
+          <w:p>
+            <w:r>
+              <w:rPr>
+                <w:rFonts w:ascii="Times New Roman" w:hAnsi="Times New Roman" w:eastAsia="Times New Roman"/>
+                <w:b w:val="0"/>
+                <w:i w:val="0"/>
+                <w:sz w:val="20"/>
+              </w:rPr>
+              <w:t>Non</w:t>
+            </w:r>
+          </w:p>
+        </w:tc>
+        <w:tc>
+          <w:tcPr>
+            <w:tcW w:type="dxa" w:w="1417"/>
+          </w:tcPr>
+          <w:p>
+            <w:r>
+              <w:rPr>
+                <w:rFonts w:ascii="Times New Roman" w:hAnsi="Times New Roman" w:eastAsia="Times New Roman"/>
+                <w:b w:val="0"/>
+                <w:i w:val="0"/>
+                <w:sz w:val="20"/>
+              </w:rPr>
+              <w:t>Partiel</w:t>
+            </w:r>
+          </w:p>
+        </w:tc>
+        <w:tc>
+          <w:tcPr>
+            <w:tcW w:type="dxa" w:w="1417"/>
+          </w:tcPr>
+          <w:p>
+            <w:r>
+              <w:rPr>
+                <w:rFonts w:ascii="Times New Roman" w:hAnsi="Times New Roman" w:eastAsia="Times New Roman"/>
+                <w:b w:val="0"/>
+                <w:i w:val="0"/>
+                <w:sz w:val="20"/>
+              </w:rPr>
+              <w:t>Non</w:t>
+            </w:r>
+          </w:p>
+        </w:tc>
+        <w:tc>
+          <w:tcPr>
+            <w:tcW w:type="dxa" w:w="1417"/>
+          </w:tcPr>
+          <w:p>
+            <w:r>
+              <w:rPr>
+                <w:rFonts w:ascii="Times New Roman" w:hAnsi="Times New Roman" w:eastAsia="Times New Roman"/>
+                <w:b w:val="0"/>
+                <w:i w:val="0"/>
+                <w:sz w:val="20"/>
+              </w:rPr>
+              <w:t>Non</w:t>
+            </w:r>
+          </w:p>
+        </w:tc>
+        <w:tc>
+          <w:tcPr>
+            <w:tcW w:type="dxa" w:w="1417"/>
+          </w:tcPr>
+          <w:p>
+            <w:r>
+              <w:rPr>
+                <w:rFonts w:ascii="Times New Roman" w:hAnsi="Times New Roman" w:eastAsia="Times New Roman"/>
+                <w:b w:val="0"/>
+                <w:i w:val="0"/>
+                <w:sz w:val="20"/>
+              </w:rPr>
+              <w:t>Oui</w:t>
+            </w:r>
+          </w:p>
+        </w:tc>
+      </w:tr>
+    </w:tbl>
+    <w:p/>
+    <w:p>
+      <w:pPr>
+        <w:spacing w:after="160" w:line="360" w:lineRule="auto"/>
+        <w:ind w:firstLine="425"/>
+        <w:jc w:val="both"/>
+      </w:pPr>
+      <w:r>
+        <w:rPr>
+          <w:rFonts w:ascii="Times New Roman" w:hAnsi="Times New Roman" w:eastAsia="Times New Roman"/>
           <w:b w:val="0"/>
-          <w:i/>
+          <w:i w:val="0"/>
           <w:sz w:val="24"/>
         </w:rPr>
-        <w:t>[Contenu du point 1.4 à coller ici]</w:t>
+        <w:t>Ce tour d'horizon montre qu'aucune solution ne couvre l'ensemble du besoin. Les plateformes d'apprentissage et les LMS gèrent surtout les contenus et les comptes. Les outils de proctoring gèrent la surveillance mais pas l'exécution pédagogique du code. Les sandboxes gèrent l'exécution isolée et presque rien d'autre. C'est dans cet espace laissé libre que se positionne Cylentic.</w:t>
       </w:r>
     </w:p>
     <w:p>
@@ -1704,17 +2936,50 @@
     </w:p>
     <w:p>
       <w:pPr>
-        <w:spacing w:after="120" w:before="0" w:line="360" w:lineRule="auto"/>
-        <w:jc w:val="left"/>
+        <w:spacing w:after="160" w:line="360" w:lineRule="auto"/>
+        <w:ind w:firstLine="425"/>
+        <w:jc w:val="both"/>
       </w:pPr>
       <w:r>
         <w:rPr>
           <w:rFonts w:ascii="Times New Roman" w:hAnsi="Times New Roman" w:eastAsia="Times New Roman"/>
           <w:b w:val="0"/>
-          <w:i/>
+          <w:i w:val="0"/>
           <w:sz w:val="24"/>
         </w:rPr>
-        <w:t>[Contenu du point 1.5 à coller ici]</w:t>
+        <w:t>Cylentic n'est pas un clone d'une plateforme d'apprentissage ouverte, ni une simple variante d'un LMS généraliste. Ces outils sont pensés pour un cadre ouvert où l'aide externe n'est pas le problème central. Cylentic répond à un besoin différent : l'évaluation surveillée de la programmation.</w:t>
+      </w:r>
+    </w:p>
+    <w:p>
+      <w:pPr>
+        <w:spacing w:after="160" w:line="360" w:lineRule="auto"/>
+        <w:ind w:firstLine="425"/>
+        <w:jc w:val="both"/>
+      </w:pPr>
+      <w:r>
+        <w:rPr>
+          <w:rFonts w:ascii="Times New Roman" w:hAnsi="Times New Roman" w:eastAsia="Times New Roman"/>
+          <w:b w:val="0"/>
+          <w:i w:val="0"/>
+          <w:sz w:val="24"/>
+        </w:rPr>
+        <w:t>Ce qui le distingue, c'est le couplage entre des éléments rarement réunis pour une épreuve de code en salle : éditeur dans le navigateur, exécution isolée via une sandbox Docker Python, contrôles de passation côté client, timers et règles métier côté serveur, journal d'incidents pour le professeur, et maintien du rôle du surveillant physique. Cylentic ajoute aussi une gouvernance multi établissement, avec un Super Admin plateforme distinct de l'administrateur d'école.</w:t>
+      </w:r>
+    </w:p>
+    <w:p>
+      <w:pPr>
+        <w:spacing w:after="160" w:line="360" w:lineRule="auto"/>
+        <w:ind w:firstLine="425"/>
+        <w:jc w:val="both"/>
+      </w:pPr>
+      <w:r>
+        <w:rPr>
+          <w:rFonts w:ascii="Times New Roman" w:hAnsi="Times New Roman" w:eastAsia="Times New Roman"/>
+          <w:b w:val="0"/>
+          <w:i w:val="0"/>
+          <w:sz w:val="24"/>
+        </w:rPr>
+        <w:t>C'est cette combinaison, plus que chaque brique prise seule, qui justifie le projet : offrir une plateforme conçue dès le départ pour l'examen de programmation surveillé, plutôt qu'un assemblage fragile d'outils incompatibles.</w:t>
       </w:r>
     </w:p>
     <w:p>
@@ -1736,22 +3001,18 @@
     </w:p>
     <w:p>
       <w:pPr>
-        <w:spacing w:after="120" w:before="0" w:line="360" w:lineRule="auto"/>
-        <w:jc w:val="left"/>
+        <w:spacing w:after="160" w:line="360" w:lineRule="auto"/>
+        <w:ind w:firstLine="425"/>
+        <w:jc w:val="both"/>
       </w:pPr>
       <w:r>
         <w:rPr>
           <w:rFonts w:ascii="Times New Roman" w:hAnsi="Times New Roman" w:eastAsia="Times New Roman"/>
           <w:b w:val="0"/>
-          <w:i/>
+          <w:i w:val="0"/>
           <w:sz w:val="24"/>
         </w:rPr>
-        <w:t>[Contenu du point 1.6 à coller ici]</w:t>
-      </w:r>
-    </w:p>
-    <w:p>
-      <w:r>
-        <w:br w:type="page"/>
+        <w:t>Ce chapitre a montré que le problème est réel : les assistants de génération de code fragilisent les devoirs traditionnels, sans que le retour au papier soit une réponse pédagogique satisfaisante. L'existant ne couvre le besoin que par fragments. Cylentic trouve sa place dans cet intervalle. Le chapitre suivant précise l'analyse des besoins et le cahier des charges.</w:t>
       </w:r>
     </w:p>
     <w:p>
@@ -1806,17 +3067,50 @@
     </w:p>
     <w:p>
       <w:pPr>
-        <w:spacing w:after="120" w:before="0" w:line="360" w:lineRule="auto"/>
-        <w:jc w:val="left"/>
+        <w:spacing w:after="160" w:line="360" w:lineRule="auto"/>
+        <w:ind w:firstLine="425"/>
+        <w:jc w:val="both"/>
       </w:pPr>
       <w:r>
         <w:rPr>
           <w:rFonts w:ascii="Times New Roman" w:hAnsi="Times New Roman" w:eastAsia="Times New Roman"/>
           <w:b w:val="0"/>
-          <w:i/>
+          <w:i w:val="0"/>
           <w:sz w:val="24"/>
         </w:rPr>
-        <w:t>[Contenu du point 2.1 à coller ici]</w:t>
+        <w:t>Le projet assume un périmètre volontairement limité pour sa première version. Le MVP inclut : le langage Python, l'authentification avec rôles (Super Admin, administrateur d'établissement, professeur, étudiant), la création d'examens, la salle d'attente, l'environnement de composition sécurisé, les mécanismes de contrôle navigateur, la correction automatique par tests unitaires, un module QCM de base, et la gestion de plusieurs établissements.</w:t>
+      </w:r>
+    </w:p>
+    <w:p>
+      <w:pPr>
+        <w:spacing w:after="160" w:line="360" w:lineRule="auto"/>
+        <w:ind w:firstLine="425"/>
+        <w:jc w:val="both"/>
+      </w:pPr>
+      <w:r>
+        <w:rPr>
+          <w:rFonts w:ascii="Times New Roman" w:hAnsi="Times New Roman" w:eastAsia="Times New Roman"/>
+          <w:b w:val="0"/>
+          <w:i w:val="0"/>
+          <w:sz w:val="24"/>
+        </w:rPr>
+        <w:t>Sont exclus de ce périmètre : le support d'autres langages que Python, la facturation réelle des établissements, l'export PDF ou Excel des résultats, la consultation en direct du code pendant l'épreuve, et l'activation de compte par email. Le MVP s'appuie plutôt sur des comptes créés par l'administration et, le cas échéant, un changement de mot de passe imposé.</w:t>
+      </w:r>
+    </w:p>
+    <w:p>
+      <w:pPr>
+        <w:spacing w:after="160" w:line="360" w:lineRule="auto"/>
+        <w:ind w:firstLine="425"/>
+        <w:jc w:val="both"/>
+      </w:pPr>
+      <w:r>
+        <w:rPr>
+          <w:rFonts w:ascii="Times New Roman" w:hAnsi="Times New Roman" w:eastAsia="Times New Roman"/>
+          <w:b w:val="0"/>
+          <w:i w:val="0"/>
+          <w:sz w:val="24"/>
+        </w:rPr>
+        <w:t>Ce périmètre restreint concentre l'effort sur le cœur du problème : la passation contrôlée et la correction automatique, plutôt que sur des fonctions secondaires.</w:t>
       </w:r>
     </w:p>
     <w:p>
@@ -1838,17 +3132,114 @@
     </w:p>
     <w:p>
       <w:pPr>
-        <w:spacing w:after="120" w:before="0" w:line="360" w:lineRule="auto"/>
-        <w:jc w:val="left"/>
+        <w:spacing w:after="160" w:line="360" w:lineRule="auto"/>
+        <w:ind w:firstLine="425"/>
+        <w:jc w:val="both"/>
       </w:pPr>
       <w:r>
         <w:rPr>
           <w:rFonts w:ascii="Times New Roman" w:hAnsi="Times New Roman" w:eastAsia="Times New Roman"/>
           <w:b w:val="0"/>
-          <w:i/>
+          <w:i w:val="0"/>
           <w:sz w:val="24"/>
         </w:rPr>
-        <w:t>[Contenu du point 2.2 à coller ici]</w:t>
+        <w:t>La plateforme distingue plusieurs acteurs, chacun avec un rôle précis.</w:t>
+      </w:r>
+    </w:p>
+    <w:p>
+      <w:pPr>
+        <w:spacing w:after="160" w:line="360" w:lineRule="auto"/>
+        <w:ind w:firstLine="425"/>
+        <w:jc w:val="both"/>
+      </w:pPr>
+      <w:r>
+        <w:rPr>
+          <w:rFonts w:ascii="Times New Roman" w:hAnsi="Times New Roman" w:eastAsia="Times New Roman"/>
+          <w:b w:val="0"/>
+          <w:i w:val="0"/>
+          <w:sz w:val="24"/>
+        </w:rPr>
+        <w:t>Le Super Admin administre la plateforme : établissements, plans et pilotage global, hors du détail pédagogique d'une école.</w:t>
+      </w:r>
+    </w:p>
+    <w:p>
+      <w:pPr>
+        <w:spacing w:after="160" w:line="360" w:lineRule="auto"/>
+        <w:ind w:firstLine="425"/>
+        <w:jc w:val="both"/>
+      </w:pPr>
+      <w:r>
+        <w:rPr>
+          <w:rFonts w:ascii="Times New Roman" w:hAnsi="Times New Roman" w:eastAsia="Times New Roman"/>
+          <w:b w:val="0"/>
+          <w:i w:val="0"/>
+          <w:sz w:val="24"/>
+        </w:rPr>
+        <w:t>L'administrateur d'établissement gère l'organisation locale : classes, années académiques, comptes professeurs et étudiants, imports de listes.</w:t>
+      </w:r>
+    </w:p>
+    <w:p>
+      <w:pPr>
+        <w:spacing w:after="160" w:line="360" w:lineRule="auto"/>
+        <w:ind w:firstLine="425"/>
+        <w:jc w:val="both"/>
+      </w:pPr>
+      <w:r>
+        <w:rPr>
+          <w:rFonts w:ascii="Times New Roman" w:hAnsi="Times New Roman" w:eastAsia="Times New Roman"/>
+          <w:b w:val="0"/>
+          <w:i w:val="0"/>
+          <w:sz w:val="24"/>
+        </w:rPr>
+        <w:t>Le professeur crée et suit les examens : énoncés, tests unitaires, publication, consultation des copies, lecture du journal d'incidents et ajustement éventuel des notes.</w:t>
+      </w:r>
+    </w:p>
+    <w:p>
+      <w:pPr>
+        <w:spacing w:after="160" w:line="360" w:lineRule="auto"/>
+        <w:ind w:firstLine="425"/>
+        <w:jc w:val="both"/>
+      </w:pPr>
+      <w:r>
+        <w:rPr>
+          <w:rFonts w:ascii="Times New Roman" w:hAnsi="Times New Roman" w:eastAsia="Times New Roman"/>
+          <w:b w:val="0"/>
+          <w:i w:val="0"/>
+          <w:sz w:val="24"/>
+        </w:rPr>
+        <w:t>L'étudiant compose : connexion avec identifiant, mot de passe et code d'examen, acceptation du plein écran, salle d'attente, écriture, exécution d'essai, soumission.</w:t>
+      </w:r>
+    </w:p>
+    <w:p>
+      <w:pPr>
+        <w:spacing w:after="160" w:line="360" w:lineRule="auto"/>
+        <w:ind w:firstLine="425"/>
+        <w:jc w:val="both"/>
+      </w:pPr>
+      <w:r>
+        <w:rPr>
+          <w:rFonts w:ascii="Times New Roman" w:hAnsi="Times New Roman" w:eastAsia="Times New Roman"/>
+          <w:b w:val="0"/>
+          <w:i w:val="0"/>
+          <w:sz w:val="24"/>
+        </w:rPr>
+        <w:t>Le surveillant physique n'a pas de compte applicatif. Il intervient en salle pour ce que le système ne voit pas.</w:t>
+      </w:r>
+    </w:p>
+    <w:p>
+      <w:pPr>
+        <w:spacing w:after="160" w:line="360" w:lineRule="auto"/>
+        <w:ind w:firstLine="425"/>
+        <w:jc w:val="both"/>
+      </w:pPr>
+      <w:r>
+        <w:rPr>
+          <w:rFonts w:ascii="Times New Roman" w:hAnsi="Times New Roman" w:eastAsia="Times New Roman"/>
+          <w:b w:val="0"/>
+          <w:i w:val="0"/>
+          <w:sz w:val="24"/>
+        </w:rPr>
+        <w:t>Le système lui-même peut être vu comme acteur technique lorsqu'il agit de façon autonome, par exemple lorsqu'une soumission est forcée à l'expiration du temps, lorsqu'un incident déclenche une exclusion, ou lorsqu'une correction automatique est lancée après dépôt de copie.</w:t>
       </w:r>
     </w:p>
     <w:p>
@@ -1870,17 +3261,98 @@
     </w:p>
     <w:p>
       <w:pPr>
-        <w:spacing w:after="120" w:before="0" w:line="360" w:lineRule="auto"/>
-        <w:jc w:val="left"/>
+        <w:spacing w:after="160" w:line="360" w:lineRule="auto"/>
+        <w:ind w:firstLine="425"/>
+        <w:jc w:val="both"/>
       </w:pPr>
       <w:r>
         <w:rPr>
           <w:rFonts w:ascii="Times New Roman" w:hAnsi="Times New Roman" w:eastAsia="Times New Roman"/>
           <w:b w:val="0"/>
-          <w:i/>
+          <w:i w:val="0"/>
           <w:sz w:val="24"/>
         </w:rPr>
-        <w:t>[Contenu du point 2.3 à coller ici]</w:t>
+        <w:t>Les besoins fonctionnels sont organisés par acteur.</w:t>
+      </w:r>
+    </w:p>
+    <w:p>
+      <w:pPr>
+        <w:spacing w:after="160" w:line="360" w:lineRule="auto"/>
+        <w:ind w:firstLine="425"/>
+        <w:jc w:val="both"/>
+      </w:pPr>
+      <w:r>
+        <w:rPr>
+          <w:rFonts w:ascii="Times New Roman" w:hAnsi="Times New Roman" w:eastAsia="Times New Roman"/>
+          <w:b w:val="0"/>
+          <w:i w:val="0"/>
+          <w:sz w:val="24"/>
+        </w:rPr>
+        <w:t>Côté Super Admin : gérer les établissements, suivre l'activité plateforme et administrer les plans associés.</w:t>
+      </w:r>
+    </w:p>
+    <w:p>
+      <w:pPr>
+        <w:spacing w:after="160" w:line="360" w:lineRule="auto"/>
+        <w:ind w:firstLine="425"/>
+        <w:jc w:val="both"/>
+      </w:pPr>
+      <w:r>
+        <w:rPr>
+          <w:rFonts w:ascii="Times New Roman" w:hAnsi="Times New Roman" w:eastAsia="Times New Roman"/>
+          <w:b w:val="0"/>
+          <w:i w:val="0"/>
+          <w:sz w:val="24"/>
+        </w:rPr>
+        <w:t>Côté administrateur : créer l'espace établissement, définir les classes, créer une année académique, importer les étudiants, gérer les comptes professeurs et étudiants (modification, désactivation, réactivation, réinitialisation de mot de passe).</w:t>
+      </w:r>
+    </w:p>
+    <w:p>
+      <w:pPr>
+        <w:spacing w:after="160" w:line="360" w:lineRule="auto"/>
+        <w:ind w:firstLine="425"/>
+        <w:jc w:val="both"/>
+      </w:pPr>
+      <w:r>
+        <w:rPr>
+          <w:rFonts w:ascii="Times New Roman" w:hAnsi="Times New Roman" w:eastAsia="Times New Roman"/>
+          <w:b w:val="0"/>
+          <w:i w:val="0"/>
+          <w:sz w:val="24"/>
+        </w:rPr>
+        <w:t>Côté professeur : créer un examen, ajouter des exercices de code et des QCM, définir des tests unitaires, publier l'examen, suivre les participations, consulter les copies, lire le journal d'incidents, ajuster les notes.</w:t>
+      </w:r>
+    </w:p>
+    <w:p>
+      <w:pPr>
+        <w:spacing w:after="160" w:line="360" w:lineRule="auto"/>
+        <w:ind w:firstLine="425"/>
+        <w:jc w:val="both"/>
+      </w:pPr>
+      <w:r>
+        <w:rPr>
+          <w:rFonts w:ascii="Times New Roman" w:hAnsi="Times New Roman" w:eastAsia="Times New Roman"/>
+          <w:b w:val="0"/>
+          <w:i w:val="0"/>
+          <w:sz w:val="24"/>
+        </w:rPr>
+        <w:t>Côté étudiant : se connecter avec identifiant, mot de passe et code d'examen, accepter le plein écran, patienter en salle d'attente, écrire et exécuter son code, soumettre avant l'expiration du temps.</w:t>
+      </w:r>
+    </w:p>
+    <w:p>
+      <w:pPr>
+        <w:spacing w:after="160" w:line="360" w:lineRule="auto"/>
+        <w:ind w:firstLine="425"/>
+        <w:jc w:val="both"/>
+      </w:pPr>
+      <w:r>
+        <w:rPr>
+          <w:rFonts w:ascii="Times New Roman" w:hAnsi="Times New Roman" w:eastAsia="Times New Roman"/>
+          <w:b w:val="0"/>
+          <w:i w:val="0"/>
+          <w:sz w:val="24"/>
+        </w:rPr>
+        <w:t>Côté système : démarrer selon la logique temporelle retenue, sauvegarder régulièrement le code, traiter les incidents selon les règles prévues, et corriger automatiquement après soumission lorsque le mode le permet.</w:t>
       </w:r>
     </w:p>
     <w:p>
@@ -1902,17 +3374,34 @@
     </w:p>
     <w:p>
       <w:pPr>
-        <w:spacing w:after="120" w:before="0" w:line="360" w:lineRule="auto"/>
-        <w:jc w:val="left"/>
+        <w:spacing w:after="160" w:line="360" w:lineRule="auto"/>
+        <w:ind w:firstLine="425"/>
+        <w:jc w:val="both"/>
       </w:pPr>
       <w:r>
         <w:rPr>
           <w:rFonts w:ascii="Times New Roman" w:hAnsi="Times New Roman" w:eastAsia="Times New Roman"/>
           <w:b w:val="0"/>
-          <w:i/>
+          <w:i w:val="0"/>
           <w:sz w:val="24"/>
         </w:rPr>
-        <w:t>[Contenu du point 2.4 à coller ici]</w:t>
+        <w:t>Au-delà des fonctions, plusieurs exigences transversales conditionnent la fiabilité du système. La sécurité doit rendre visible et coûteux le contournement de l'environnement de composition. La fiabilité doit limiter la perte de copie en cas de fermeture brutale ou de coupure courte. La performance doit supporter un pic de soumissions. La facilité d'usage le jour J doit rester une priorité. La compatibilité vise Chrome et Edge sur poste de travail. La résilience réseau doit permettre une reprise sans pénalité injustifiée. L'isolation de la sandbox doit empêcher l'accès réseau depuis le code exécuté. L'isolation multi établissement doit empêcher tout accès croisé aux données.</w:t>
+      </w:r>
+    </w:p>
+    <w:p>
+      <w:pPr>
+        <w:spacing w:after="160" w:line="360" w:lineRule="auto"/>
+        <w:ind w:firstLine="425"/>
+        <w:jc w:val="both"/>
+      </w:pPr>
+      <w:r>
+        <w:rPr>
+          <w:rFonts w:ascii="Times New Roman" w:hAnsi="Times New Roman" w:eastAsia="Times New Roman"/>
+          <w:b w:val="0"/>
+          <w:i w:val="0"/>
+          <w:sz w:val="24"/>
+        </w:rPr>
+        <w:t>Ces exigences sont formulées comme des critères vérifiables, susceptibles d'être testés lors de la recette.</w:t>
       </w:r>
     </w:p>
     <w:p>
@@ -1934,17 +3423,18 @@
     </w:p>
     <w:p>
       <w:pPr>
-        <w:spacing w:after="120" w:before="0" w:line="360" w:lineRule="auto"/>
-        <w:jc w:val="left"/>
+        <w:spacing w:after="160" w:line="360" w:lineRule="auto"/>
+        <w:ind w:firstLine="425"/>
+        <w:jc w:val="both"/>
       </w:pPr>
       <w:r>
         <w:rPr>
           <w:rFonts w:ascii="Times New Roman" w:hAnsi="Times New Roman" w:eastAsia="Times New Roman"/>
           <w:b w:val="0"/>
-          <w:i/>
+          <w:i w:val="0"/>
           <w:sz w:val="24"/>
         </w:rPr>
-        <w:t>[Contenu du point 2.5 à coller ici]</w:t>
+        <w:t>Plusieurs règles métier structurent le fonctionnement. Le code d'accès d'un examen est généré dans un format lisible, sans caractères ambigus. Un examen publié devient la référence de passation ; une fois l'épreuve engagée, le contenu n'est plus librement modifiable. Les sorties répétées du plein écran entraînent un avertissement puis une exclusion technique avec soumission forcée. Un étudiant ne voit pas son score immédiatement après dépôt. Les identifiants sont structurés selon le rôle, ce qui permet de déduire ce rôle à la connexion. Les données de chaque établissement restent isolées. La plateforme prévoit aussi une limite forte sur le nombre d'administrateurs actifs par établissement.</w:t>
       </w:r>
     </w:p>
     <w:p>
@@ -1966,17 +3456,18 @@
     </w:p>
     <w:p>
       <w:pPr>
-        <w:spacing w:after="120" w:before="0" w:line="360" w:lineRule="auto"/>
-        <w:jc w:val="left"/>
+        <w:spacing w:after="160" w:line="360" w:lineRule="auto"/>
+        <w:ind w:firstLine="425"/>
+        <w:jc w:val="both"/>
       </w:pPr>
       <w:r>
         <w:rPr>
           <w:rFonts w:ascii="Times New Roman" w:hAnsi="Times New Roman" w:eastAsia="Times New Roman"/>
           <w:b w:val="0"/>
-          <w:i/>
+          <w:i w:val="0"/>
           <w:sz w:val="24"/>
         </w:rPr>
-        <w:t>[Contenu du point 2.6 à coller ici]</w:t>
+        <w:t>Plusieurs scénarios concrets illustrent l'usage attendu. Le professeur prépare l'examen à l'avance, définit exercices et tests, puis publie l'épreuve. Le jour J, il communique le code d'accès. Les étudiants se connectent et rejoignent la salle d'attente. Au démarrage, ils passent en composition. Pendant l'épreuve, un changement d'onglet est journalisé ; une sortie du plein écran déclenche d'abord un avertissement, puis une exclusion au seuil prévu. Une coupure réseau courte ne doit pas effacer le travail déjà sauvegardé. À l'expiration du temps, la copie en cours est soumise automatiquement. Après l'épreuve, le professeur lit le journal avant de communiquer les résultats.</w:t>
       </w:r>
     </w:p>
     <w:p>
@@ -1998,22 +3489,18 @@
     </w:p>
     <w:p>
       <w:pPr>
-        <w:spacing w:after="120" w:before="0" w:line="360" w:lineRule="auto"/>
-        <w:jc w:val="left"/>
+        <w:spacing w:after="160" w:line="360" w:lineRule="auto"/>
+        <w:ind w:firstLine="425"/>
+        <w:jc w:val="both"/>
       </w:pPr>
       <w:r>
         <w:rPr>
           <w:rFonts w:ascii="Times New Roman" w:hAnsi="Times New Roman" w:eastAsia="Times New Roman"/>
           <w:b w:val="0"/>
-          <w:i/>
+          <w:i w:val="0"/>
           <w:sz w:val="24"/>
         </w:rPr>
-        <w:t>[Contenu du point 2.7 à coller ici]</w:t>
-      </w:r>
-    </w:p>
-    <w:p>
-      <w:r>
-        <w:br w:type="page"/>
+        <w:t>Le cahier des charges de Cylentic est posé : périmètre du MVP, acteurs, besoins fonctionnels et non fonctionnels, règles métier et scénarios prioritaires. Sur cette base, la conception du chapitre suivant peut se développer sans improvisation fonctionnelle.</w:t>
       </w:r>
     </w:p>
     <w:p>

</xml_diff>

<commit_message>
Corrige l'intégration des chapitres 4 et 5 dans le rapport Word.
Cible les titres Heading du corps (plus le sommaire) et aligne le
contenu sur le dépôt GitHub à jour.

Co-authored-by: progirix <progirix@users.noreply.github.com>
</commit_message>
<xml_diff>
--- a/docs/Rapport_Cylentic_Carcasse_Chapitre3.docx
+++ b/docs/Rapport_Cylentic_Carcasse_Chapitre3.docx
@@ -3078,7 +3078,7 @@
           <w:i w:val="0"/>
           <w:sz w:val="24"/>
         </w:rPr>
-        <w:t>Le projet assume un périmètre volontairement limité pour sa première version. Le MVP inclut : le langage Python, l'authentification avec rôles (Super Admin, administrateur d'établissement, professeur, étudiant), la création d'examens, la salle d'attente, l'environnement de composition sécurisé, les mécanismes de contrôle navigateur, la correction automatique par tests unitaires, un module QCM de base, et la gestion de plusieurs établissements.</w:t>
+        <w:t>Le projet assume un périmètre volontairement limité pour sa première version. Le MVP inclut : le langage Python, l'authentification avec rôles (Super Admin, administrateur d'établissement, professeur, étudiant), la création et la publication d'examens, la salle d'attente, l'environnement de composition sécurisé, les mécanismes de contrôle navigateur, la correction automatique par tests unitaires, un module QCM de base, la gestion de plusieurs établissements, l'onboarding administrateur, la promotion de rentrée, le contact depuis la landing page, ainsi que les exports de résultats et de présence.</w:t>
       </w:r>
     </w:p>
     <w:p>
@@ -3094,7 +3094,7 @@
           <w:i w:val="0"/>
           <w:sz w:val="24"/>
         </w:rPr>
-        <w:t>Sont exclus de ce périmètre : le support d'autres langages que Python, la facturation réelle des établissements, l'export PDF ou Excel des résultats, la consultation en direct du code pendant l'épreuve, et l'activation de compte par email. Le MVP s'appuie plutôt sur des comptes créés par l'administration et, le cas échéant, un changement de mot de passe imposé.</w:t>
+        <w:t>Sont exclus de ce périmètre : le support d'autres langages que Python, la facturation réelle des établissements, la consultation en direct du code pendant l'épreuve, et l'activation de compte par email. Le MVP s'appuie sur des comptes créés par l'administration, un changement de mot de passe imposé si nécessaire, et des exports de résultats déjà disponibles pour le professeur (Excel, PDF) ainsi qu'un export de présence (CSV).</w:t>
       </w:r>
     </w:p>
     <w:p>
@@ -3740,7 +3740,7 @@
           <w:i w:val="0"/>
           <w:sz w:val="24"/>
         </w:rPr>
-        <w:t>Le diagramme de déploiement traduit cette architecture en nœuds d'exécution. Le poste utilisateur héberge le navigateur. Le serveur d'application héberge Next.js et les workers. MySQL et Redis apparaissent comme nœuds de données. L'hôte d'exécution isolée accueille le conteneur sandbox. En production, le lien navigateur application est prévu en HTTPS. En développement local, le même produit tourne souvent en HTTP sur localhost ; le modèle de déploiement décrit la cible d'exploitation.</w:t>
+        <w:t>Le diagramme de déploiement traduit cette architecture en nœuds d'exécution. Le poste utilisateur héberge le navigateur. Le serveur d'application héberge Next.js. MySQL porte la persistance. Redis et les workers apparaissent comme perspectives d'industrialisation. L'hôte d'exécution isolée accueille le conteneur sandbox. En production, le lien navigateur application est prévu en HTTPS. En démonstration salle, le même produit peut tourner en HTTP sur le réseau local.</w:t>
       </w:r>
     </w:p>
     <w:p>
@@ -5861,7 +5861,7 @@
           <w:i w:val="0"/>
           <w:sz w:val="24"/>
         </w:rPr>
-        <w:t>MySQL conserve la mémoire durable : sujets, copies, scores, journaux. Redis est positionné pour les besoins de file et de coordination des workers. Cette séparation évite de faire porter à la base relationnelle des responsabilités de file d'attente pour lesquelles elle est moins naturelle. En retour, la correction et le suivi pédagogique restent interrogeables par requêtes classiques après l'épreuve.</w:t>
+        <w:t>MySQL conserve la mémoire durable : sujets, copies, scores, journaux. Redis et des workers de file sont prévus dans l'architecture cible pour absorber des pics de correction et enrichir le temps réel. Dans le MVP livré, ces briques ne sont pas encore industrialisées : le suivi live repose sur du polling HTTP, et la correction automatique est déclenchée dans le parcours de soumission.</w:t>
       </w:r>
     </w:p>
     <w:p>
@@ -6099,7 +6099,7 @@
     </w:p>
     <w:p>
       <w:pPr>
-        <w:spacing w:after="160" w:before="0" w:line="360" w:lineRule="auto"/>
+        <w:spacing w:after="160" w:line="360" w:lineRule="auto"/>
         <w:ind w:firstLine="425"/>
         <w:jc w:val="both"/>
       </w:pPr>
@@ -6110,14 +6110,13 @@
           <w:i w:val="0"/>
           <w:sz w:val="24"/>
         </w:rPr>
-        <w:t>Ce chapitre décrit l'environnement de travail, les choix technologiques, l'organisation du code, la réalisation des modules principaux, les points techniques difficiles et le déploiement du MVP.</w:t>
+        <w:t>Une fois le cadrage et la conception posés, la réalisation a pour objet de transformer le cahier des charges en un produit exécutable. L'équipe a cherché un dépôt unique, déployable localement, capable de faire vivre les rôles de la plateforme et surtout de faire passer un examen du début à la fin : création, publication, composition sous contraintes, correction, puis exports.</w:t>
       </w:r>
     </w:p>
     <w:p>
       <w:pPr>
         <w:pStyle w:val="Heading2"/>
-        <w:keepNext/>
-        <w:spacing w:before="200" w:after="200" w:line="360" w:lineRule="auto"/>
+        <w:spacing w:before="240" w:after="160" w:line="360" w:lineRule="auto"/>
         <w:jc w:val="left"/>
       </w:pPr>
       <w:r>
@@ -6132,8 +6131,328 @@
     </w:p>
     <w:p>
       <w:pPr>
-        <w:spacing w:after="120" w:before="0" w:line="360" w:lineRule="auto"/>
+        <w:spacing w:after="160" w:line="360" w:lineRule="auto"/>
+        <w:ind w:firstLine="425"/>
+        <w:jc w:val="both"/>
+      </w:pPr>
+      <w:r>
+        <w:rPr>
+          <w:rFonts w:ascii="Times New Roman" w:hAnsi="Times New Roman" w:eastAsia="Times New Roman"/>
+          <w:b w:val="0"/>
+          <w:i w:val="0"/>
+          <w:sz w:val="24"/>
+        </w:rPr>
+        <w:t>Le projet repose sur Node.js et npm, avec Next.js 16 en App Router pour les pages et les API. Prisma 7 s'appuie sur MySQL pour le modèle de données. Docker sert à isoler l'exécution du code Python des étudiants. L'édition et le suivi se font principalement dans VS Code ou Cursor. Les essais de passation et de contrôle navigateur ont été menés en priorité sur Chrome et Edge, navigateurs compatibles avec l'API Fullscreen.</w:t>
+      </w:r>
+    </w:p>
+    <w:p>
+      <w:pPr>
+        <w:spacing w:after="160" w:line="360" w:lineRule="auto"/>
+        <w:ind w:firstLine="425"/>
+        <w:jc w:val="both"/>
+      </w:pPr>
+      <w:r>
+        <w:rPr>
+          <w:rFonts w:ascii="Times New Roman" w:hAnsi="Times New Roman" w:eastAsia="Times New Roman"/>
+          <w:b w:val="0"/>
+          <w:i w:val="0"/>
+          <w:sz w:val="24"/>
+        </w:rPr>
+        <w:t>Pour installer et démarrer le projet en local, la séquence habituelle est npm install, puis npm run db:setup, puis npm run dev. En démonstration multi postes sur le réseau local, un build de production est préférable (npm run build, puis npx next start -H 0.0.0.0 -p 3000). Les variables critiques restent DATABASE_URL, JWT_SECRET et JWT_EXPIRES_IN. Le drapeau FORCE_SECURE_COOKIES n'est utile que derrière un reverse proxy HTTPS.</w:t>
+      </w:r>
+    </w:p>
+    <w:p>
+      <w:pPr>
+        <w:pStyle w:val="Heading2"/>
+        <w:spacing w:before="240" w:after="160" w:line="360" w:lineRule="auto"/>
         <w:jc w:val="left"/>
+      </w:pPr>
+      <w:r>
+        <w:rPr>
+          <w:rFonts w:ascii="Times New Roman" w:hAnsi="Times New Roman" w:eastAsia="Times New Roman"/>
+          <w:b/>
+          <w:i w:val="0"/>
+          <w:sz w:val="28"/>
+        </w:rPr>
+        <w:t>4.2 Choix technologiques</w:t>
+      </w:r>
+    </w:p>
+    <w:p>
+      <w:pPr>
+        <w:spacing w:after="160" w:line="360" w:lineRule="auto"/>
+        <w:ind w:firstLine="425"/>
+        <w:jc w:val="both"/>
+      </w:pPr>
+      <w:r>
+        <w:rPr>
+          <w:rFonts w:ascii="Times New Roman" w:hAnsi="Times New Roman" w:eastAsia="Times New Roman"/>
+          <w:b w:val="0"/>
+          <w:i w:val="0"/>
+          <w:sz w:val="24"/>
+        </w:rPr>
+        <w:t>Le choix d'un monolithe Next.js centralise pages et routes API dans un seul déploiement, ce qui simplifie le jour J. Prisma apporte un typage fort et un schéma déclaratif, au prix de quelques subtilités de sérialisation, notamment pour les décimaux côté composants clients. L'authentification par JWT en cookie httpOnly reste adaptée à un MVP et évite une session serveur lourde. Monaco Editor offre une expérience proche d'un IDE moderne.</w:t>
+      </w:r>
+    </w:p>
+    <w:p>
+      <w:pPr>
+        <w:spacing w:after="160" w:line="360" w:lineRule="auto"/>
+        <w:ind w:firstLine="425"/>
+        <w:jc w:val="both"/>
+      </w:pPr>
+      <w:r>
+        <w:rPr>
+          <w:rFonts w:ascii="Times New Roman" w:hAnsi="Times New Roman" w:eastAsia="Times New Roman"/>
+          <w:b w:val="0"/>
+          <w:i w:val="0"/>
+          <w:sz w:val="24"/>
+        </w:rPr>
+        <w:t>L'exécution du code étudiant dans un conteneur Docker vise une isolation réelle. Zod valide les entrées API. Le temps réel a volontairement été traité par polling HTTP plutôt que par WebSocket et Redis, afin de livrer d'abord un comportement fiable sans infrastructure supplémentaire. Redis et les workers restent donc des perspectives d'industrialisation, et non des dépendances du parcours critique actuel.</w:t>
+      </w:r>
+    </w:p>
+    <w:p>
+      <w:pPr>
+        <w:pStyle w:val="Heading2"/>
+        <w:spacing w:before="240" w:after="160" w:line="360" w:lineRule="auto"/>
+        <w:jc w:val="left"/>
+      </w:pPr>
+      <w:r>
+        <w:rPr>
+          <w:rFonts w:ascii="Times New Roman" w:hAnsi="Times New Roman" w:eastAsia="Times New Roman"/>
+          <w:b/>
+          <w:i w:val="0"/>
+          <w:sz w:val="28"/>
+        </w:rPr>
+        <w:t>4.3 Organisation du code et architecture applicative</w:t>
+      </w:r>
+    </w:p>
+    <w:p>
+      <w:pPr>
+        <w:spacing w:after="160" w:line="360" w:lineRule="auto"/>
+        <w:ind w:firstLine="425"/>
+        <w:jc w:val="both"/>
+      </w:pPr>
+      <w:r>
+        <w:rPr>
+          <w:rFonts w:ascii="Times New Roman" w:hAnsi="Times New Roman" w:eastAsia="Times New Roman"/>
+          <w:b w:val="0"/>
+          <w:i w:val="0"/>
+          <w:sz w:val="24"/>
+        </w:rPr>
+        <w:t>La règle générale a été de limiter la logique métier dans les pages. Les pages authentifient, orchestrent et affichent. Les services encapsulent les invariants : limites d'administrateurs, verrous d'examen, correction, promotion de rentrée, exports, etc.</w:t>
+      </w:r>
+    </w:p>
+    <w:p>
+      <w:pPr>
+        <w:spacing w:after="160" w:line="360" w:lineRule="auto"/>
+        <w:ind w:firstLine="425"/>
+        <w:jc w:val="both"/>
+      </w:pPr>
+      <w:r>
+        <w:rPr>
+          <w:rFonts w:ascii="Times New Roman" w:hAnsi="Times New Roman" w:eastAsia="Times New Roman"/>
+          <w:b w:val="0"/>
+          <w:i w:val="0"/>
+          <w:sz w:val="24"/>
+        </w:rPr>
+        <w:t>Côté présentation, les routes publiques regroupent landing, connexion et inscription d'établissement. Les espaces authentifiés sont séparés par rôle. Les API suivent une convention JSON homogène, avec un booléen success et, selon le cas, un objet data ou un message d'erreur. Les services mobilisés couvrent notamment l'authentification, les utilisateurs, les examens, la participation, la correction, la sandbox, le billing des plans, la promotion, le contact landing, les exports et les tableaux de bord.</w:t>
+      </w:r>
+    </w:p>
+    <w:p>
+      <w:pPr>
+        <w:pStyle w:val="Heading2"/>
+        <w:spacing w:before="240" w:after="160" w:line="360" w:lineRule="auto"/>
+        <w:jc w:val="left"/>
+      </w:pPr>
+      <w:r>
+        <w:rPr>
+          <w:rFonts w:ascii="Times New Roman" w:hAnsi="Times New Roman" w:eastAsia="Times New Roman"/>
+          <w:b/>
+          <w:i w:val="0"/>
+          <w:sz w:val="28"/>
+        </w:rPr>
+        <w:t>4.4 Réalisation des modules principaux</w:t>
+      </w:r>
+    </w:p>
+    <w:p>
+      <w:pPr>
+        <w:pStyle w:val="Heading3"/>
+        <w:spacing w:before="240" w:after="160" w:line="360" w:lineRule="auto"/>
+        <w:jc w:val="left"/>
+      </w:pPr>
+      <w:r>
+        <w:rPr>
+          <w:rFonts w:ascii="Times New Roman" w:hAnsi="Times New Roman" w:eastAsia="Times New Roman"/>
+          <w:b/>
+          <w:i w:val="0"/>
+          <w:sz w:val="24"/>
+        </w:rPr>
+        <w:t>4.4.1 Authentification et sessions</w:t>
+      </w:r>
+    </w:p>
+    <w:p>
+      <w:pPr>
+        <w:spacing w:after="160" w:line="360" w:lineRule="auto"/>
+        <w:ind w:firstLine="425"/>
+        <w:jc w:val="both"/>
+      </w:pPr>
+      <w:r>
+        <w:rPr>
+          <w:rFonts w:ascii="Times New Roman" w:hAnsi="Times New Roman" w:eastAsia="Times New Roman"/>
+          <w:b w:val="0"/>
+          <w:i w:val="0"/>
+          <w:sz w:val="24"/>
+        </w:rPr>
+        <w:t>À la connexion, le rôle n'est pas choisi manuellement : il est déduit du préfixe d'identifiant (SADM-, ADM-, PROF-, ETU-). Le JWT signe les informations utiles (identifiant technique, identité affichable, rôle, établissement, obligation de changer le mot de passe) et est stocké dans le cookie de session, en httpOnly, avec SameSite=Lax.</w:t>
+      </w:r>
+    </w:p>
+    <w:p>
+      <w:pPr>
+        <w:spacing w:after="160" w:line="360" w:lineRule="auto"/>
+        <w:ind w:firstLine="425"/>
+        <w:jc w:val="both"/>
+      </w:pPr>
+      <w:r>
+        <w:rPr>
+          <w:rFonts w:ascii="Times New Roman" w:hAnsi="Times New Roman" w:eastAsia="Times New Roman"/>
+          <w:b w:val="0"/>
+          <w:i w:val="0"/>
+          <w:sz w:val="24"/>
+        </w:rPr>
+        <w:t>Un point sensible a été corrigé pendant la réalisation. Avec next start, l'environnement passe en production et le cookie était initialement marqué Secure. Or, en accès salle via une adresse HTTP locale, le navigateur refuse ce cookie. La connexion semblait alors échouer pour tous les profils. La solution livrée active Secure uniquement lorsque la requête est réellement en HTTPS, ou si FORCE_SECURE_COOKIES est explicitement forcé.</w:t>
+      </w:r>
+    </w:p>
+    <w:p>
+      <w:pPr>
+        <w:pStyle w:val="Heading3"/>
+        <w:spacing w:before="240" w:after="160" w:line="360" w:lineRule="auto"/>
+        <w:jc w:val="left"/>
+      </w:pPr>
+      <w:r>
+        <w:rPr>
+          <w:rFonts w:ascii="Times New Roman" w:hAnsi="Times New Roman" w:eastAsia="Times New Roman"/>
+          <w:b/>
+          <w:i w:val="0"/>
+          <w:sz w:val="24"/>
+        </w:rPr>
+        <w:t>4.4.2 Module administrateur d'établissement</w:t>
+      </w:r>
+    </w:p>
+    <w:p>
+      <w:pPr>
+        <w:spacing w:after="160" w:line="360" w:lineRule="auto"/>
+        <w:ind w:firstLine="425"/>
+        <w:jc w:val="both"/>
+      </w:pPr>
+      <w:r>
+        <w:rPr>
+          <w:rFonts w:ascii="Times New Roman" w:hAnsi="Times New Roman" w:eastAsia="Times New Roman"/>
+          <w:b w:val="0"/>
+          <w:i w:val="0"/>
+          <w:sz w:val="24"/>
+        </w:rPr>
+        <w:t>Après inscription, l'administrateur est guidé dans un onboarding : année académique, classes, premiers utilisateurs. Tant que ces étapes ne sont pas complètes, le tableau de bord peut rediriger vers le parcours d'installation. Les tableaux de bord présentent ensuite population, examens et activité. Les étudiants peuvent être créés manuellement ou importés par CSV, avec un rapport d'erreurs ligne à ligne. Les professeurs reçoivent un identifiant PROF-* et un mot de passe par défaut. Les administrateurs sont plafonnés à deux comptes actifs : on ne peut pas s'auto désactiver, et le système refuse de laisser l'établissement sans administrateur actif.</w:t>
+      </w:r>
+    </w:p>
+    <w:p>
+      <w:pPr>
+        <w:spacing w:after="160" w:line="360" w:lineRule="auto"/>
+        <w:ind w:firstLine="425"/>
+        <w:jc w:val="both"/>
+      </w:pPr>
+      <w:r>
+        <w:rPr>
+          <w:rFonts w:ascii="Times New Roman" w:hAnsi="Times New Roman" w:eastAsia="Times New Roman"/>
+          <w:b w:val="0"/>
+          <w:i w:val="0"/>
+          <w:sz w:val="24"/>
+        </w:rPr>
+        <w:t>La promotion de rentrée a aussi été livrée. Le parcours propose le choix ou la création de l'année cible, l'association des classes sources vers les classes de destination, puis la confirmation. La transaction met à jour les profils étudiants, active la nouvelle année et peut archiver l'année précédente.</w:t>
+      </w:r>
+    </w:p>
+    <w:p>
+      <w:pPr>
+        <w:pStyle w:val="Heading3"/>
+        <w:spacing w:before="240" w:after="160" w:line="360" w:lineRule="auto"/>
+        <w:jc w:val="left"/>
+      </w:pPr>
+      <w:r>
+        <w:rPr>
+          <w:rFonts w:ascii="Times New Roman" w:hAnsi="Times New Roman" w:eastAsia="Times New Roman"/>
+          <w:b/>
+          <w:i w:val="0"/>
+          <w:sz w:val="24"/>
+        </w:rPr>
+        <w:t>4.4.3 Module professeur</w:t>
+      </w:r>
+    </w:p>
+    <w:p>
+      <w:pPr>
+        <w:spacing w:after="160" w:line="360" w:lineRule="auto"/>
+        <w:ind w:firstLine="425"/>
+        <w:jc w:val="both"/>
+      </w:pPr>
+      <w:r>
+        <w:rPr>
+          <w:rFonts w:ascii="Times New Roman" w:hAnsi="Times New Roman" w:eastAsia="Times New Roman"/>
+          <w:b w:val="0"/>
+          <w:i w:val="0"/>
+          <w:sz w:val="24"/>
+        </w:rPr>
+        <w:t>Le cycle de vie d'un examen reste celui conçu au chapitre 3. Le professeur crée un brouillon, compose les exercices (code Python avec tests et/ou QCM), puis publie. La publication génère un code d'accès affichable aussi en mode présentation pour le vidéoprojecteur. Pendant l'épreuve, le suivi live montre les statuts. Après l'examen, le professeur consulte les copies, peut ajuster une note manuelle et exporter les résultats (Excel, PDF) ainsi que la présence (CSV).</w:t>
+      </w:r>
+    </w:p>
+    <w:p>
+      <w:pPr>
+        <w:spacing w:after="160" w:line="360" w:lineRule="auto"/>
+        <w:ind w:firstLine="425"/>
+        <w:jc w:val="both"/>
+      </w:pPr>
+      <w:r>
+        <w:rPr>
+          <w:rFonts w:ascii="Times New Roman" w:hAnsi="Times New Roman" w:eastAsia="Times New Roman"/>
+          <w:b w:val="0"/>
+          <w:i w:val="0"/>
+          <w:sz w:val="24"/>
+        </w:rPr>
+        <w:t>Plusieurs capacités ont étendu le MVP en cours de projet. Le planning peut être modifié sur un examen publié, avec synchronisation côté composition. Le contenu reste modifiable tant que la date de début n'est pas atteinte, via une règle partagée de verrouillage. La duplication crée un nouveau brouillon en reprenant la structure sans recopier les participations.</w:t>
+      </w:r>
+    </w:p>
+    <w:p>
+      <w:pPr>
+        <w:pStyle w:val="Heading3"/>
+        <w:spacing w:before="240" w:after="160" w:line="360" w:lineRule="auto"/>
+        <w:jc w:val="left"/>
+      </w:pPr>
+      <w:r>
+        <w:rPr>
+          <w:rFonts w:ascii="Times New Roman" w:hAnsi="Times New Roman" w:eastAsia="Times New Roman"/>
+          <w:b/>
+          <w:i w:val="0"/>
+          <w:sz w:val="24"/>
+        </w:rPr>
+        <w:t>4.4.4 Module étudiant et parcours de composition</w:t>
+      </w:r>
+    </w:p>
+    <w:p>
+      <w:pPr>
+        <w:spacing w:after="160" w:line="360" w:lineRule="auto"/>
+        <w:ind w:firstLine="425"/>
+        <w:jc w:val="both"/>
+      </w:pPr>
+      <w:r>
+        <w:rPr>
+          <w:rFonts w:ascii="Times New Roman" w:hAnsi="Times New Roman" w:eastAsia="Times New Roman"/>
+          <w:b w:val="0"/>
+          <w:i w:val="0"/>
+          <w:sz w:val="24"/>
+        </w:rPr>
+        <w:t>Le parcours étudiant est volontairement explicite. La première page présente les consignes et exige le plein écran. Tant que l'API Fullscreen est refusée ou indisponible, l'étudiant ne peut pas avancer. Une fois le plein écran accepté, il entre en salle d'attente. Un compte à rebours est synchronisé avec le serveur via un polling sur l'API de session. L'énoncé reste masqué. Dès cette étape, l'heure de connexion et l'adresse IP sont enregistrées.</w:t>
+      </w:r>
+    </w:p>
+    <w:p>
+      <w:pPr>
+        <w:spacing w:after="80" w:line="360" w:lineRule="auto"/>
+        <w:jc w:val="center"/>
       </w:pPr>
       <w:r>
         <w:rPr>
@@ -6142,30 +6461,59 @@
           <w:i/>
           <w:sz w:val="24"/>
         </w:rPr>
-        <w:t>[Contenu du point 4.1 à coller ici]</w:t>
-      </w:r>
-    </w:p>
-    <w:p>
-      <w:pPr>
-        <w:pStyle w:val="Heading2"/>
-        <w:keepNext/>
-        <w:spacing w:before="200" w:after="200" w:line="360" w:lineRule="auto"/>
-        <w:jc w:val="left"/>
-      </w:pPr>
-      <w:r>
-        <w:rPr>
-          <w:rFonts w:ascii="Times New Roman" w:hAnsi="Times New Roman" w:eastAsia="Times New Roman"/>
-          <w:b/>
-          <w:i w:val="0"/>
-          <w:sz w:val="28"/>
-        </w:rPr>
-        <w:t>4.2 Choix technologiques</w:t>
-      </w:r>
-    </w:p>
-    <w:p>
-      <w:pPr>
-        <w:spacing w:after="120" w:before="0" w:line="360" w:lineRule="auto"/>
-        <w:jc w:val="left"/>
+        <w:t>[Emplacement de la figure 4.1]</w:t>
+      </w:r>
+    </w:p>
+    <w:p>
+      <w:pPr>
+        <w:spacing w:after="80" w:line="360" w:lineRule="auto"/>
+        <w:jc w:val="center"/>
+      </w:pPr>
+      <w:r>
+        <w:rPr>
+          <w:rFonts w:ascii="Times New Roman" w:hAnsi="Times New Roman" w:eastAsia="Times New Roman"/>
+          <w:b w:val="0"/>
+          <w:i/>
+          <w:sz w:val="22"/>
+        </w:rPr>
+        <w:t>Insérer la capture de la salle d'attente (compte à rebours, énoncé masqué).</w:t>
+      </w:r>
+    </w:p>
+    <w:p>
+      <w:pPr>
+        <w:spacing w:after="240" w:line="360" w:lineRule="auto"/>
+        <w:jc w:val="center"/>
+      </w:pPr>
+      <w:r>
+        <w:rPr>
+          <w:rFonts w:ascii="Times New Roman" w:hAnsi="Times New Roman" w:eastAsia="Times New Roman"/>
+          <w:b w:val="0"/>
+          <w:i w:val="0"/>
+          <w:sz w:val="22"/>
+        </w:rPr>
+        <w:t>Figure 4.1 : Salle d'attente avant le démarrage de l'examen</w:t>
+      </w:r>
+    </w:p>
+    <w:p>
+      <w:pPr>
+        <w:spacing w:after="160" w:line="360" w:lineRule="auto"/>
+        <w:ind w:firstLine="425"/>
+        <w:jc w:val="both"/>
+      </w:pPr>
+      <w:r>
+        <w:rPr>
+          <w:rFonts w:ascii="Times New Roman" w:hAnsi="Times New Roman" w:eastAsia="Times New Roman"/>
+          <w:b w:val="0"/>
+          <w:i w:val="0"/>
+          <w:sz w:val="24"/>
+        </w:rPr>
+        <w:t>Au démarrage, la page de composition affiche le menu des exercices, l'énoncé, l'éditeur Monaco pour Python, le bouton d'exécution, le timer global et la soumission. Un autosave périodique, complété par le stockage local du navigateur, limite les pertes en cas de coupure brève. Un second polling permet de mettre à jour la fin d'examen si le professeur modifie le planning en cours de session.</w:t>
+      </w:r>
+    </w:p>
+    <w:p>
+      <w:pPr>
+        <w:spacing w:after="80" w:line="360" w:lineRule="auto"/>
+        <w:jc w:val="center"/>
       </w:pPr>
       <w:r>
         <w:rPr>
@@ -6174,46 +6522,123 @@
           <w:i/>
           <w:sz w:val="24"/>
         </w:rPr>
-        <w:t>[Contenu du point 4.2 à coller ici]</w:t>
-      </w:r>
-    </w:p>
-    <w:p>
-      <w:pPr>
-        <w:pStyle w:val="Heading2"/>
-        <w:keepNext/>
-        <w:spacing w:before="200" w:after="200" w:line="360" w:lineRule="auto"/>
-        <w:jc w:val="left"/>
-      </w:pPr>
-      <w:r>
-        <w:rPr>
-          <w:rFonts w:ascii="Times New Roman" w:hAnsi="Times New Roman" w:eastAsia="Times New Roman"/>
-          <w:b/>
-          <w:i w:val="0"/>
-          <w:sz w:val="28"/>
-        </w:rPr>
-        <w:t>4.3 Organisation du code et architecture applicative</w:t>
-      </w:r>
-    </w:p>
-    <w:p>
-      <w:pPr>
-        <w:spacing w:after="120" w:before="0" w:line="360" w:lineRule="auto"/>
-        <w:jc w:val="left"/>
+        <w:t>[Emplacement de la figure 4.2]</w:t>
+      </w:r>
+    </w:p>
+    <w:p>
+      <w:pPr>
+        <w:spacing w:after="80" w:line="360" w:lineRule="auto"/>
+        <w:jc w:val="center"/>
       </w:pPr>
       <w:r>
         <w:rPr>
           <w:rFonts w:ascii="Times New Roman" w:hAnsi="Times New Roman" w:eastAsia="Times New Roman"/>
           <w:b w:val="0"/>
           <w:i/>
+          <w:sz w:val="22"/>
+        </w:rPr>
+        <w:t>Insérer la capture de la page de composition (IDE, timer, exercices).</w:t>
+      </w:r>
+    </w:p>
+    <w:p>
+      <w:pPr>
+        <w:spacing w:after="240" w:line="360" w:lineRule="auto"/>
+        <w:jc w:val="center"/>
+      </w:pPr>
+      <w:r>
+        <w:rPr>
+          <w:rFonts w:ascii="Times New Roman" w:hAnsi="Times New Roman" w:eastAsia="Times New Roman"/>
+          <w:b w:val="0"/>
+          <w:i w:val="0"/>
+          <w:sz w:val="22"/>
+        </w:rPr>
+        <w:t>Figure 4.2 : Environnement de composition pendant l'épreuve</w:t>
+      </w:r>
+    </w:p>
+    <w:p>
+      <w:pPr>
+        <w:spacing w:after="160" w:line="360" w:lineRule="auto"/>
+        <w:ind w:firstLine="425"/>
+        <w:jc w:val="both"/>
+      </w:pPr>
+      <w:r>
+        <w:rPr>
+          <w:rFonts w:ascii="Times New Roman" w:hAnsi="Times New Roman" w:eastAsia="Times New Roman"/>
+          <w:b w:val="0"/>
+          <w:i w:val="0"/>
           <w:sz w:val="24"/>
         </w:rPr>
-        <w:t>[Contenu du point 4.3 à coller ici]</w:t>
+        <w:t>Les contrôles de passation signalent au serveur les sorties de plein écran, les changements d'onglet et certains collages. Au second incident de sortie du plein écran, la participation est exclue et redirigée vers une confirmation avec motif. La soumission peut être manuelle, automatique à l'expiration du timer, ou forcée par exclusion. Une fois la participation close, aucune reconnexion utile n'est possible. Aucun score n'est montré à l'étudiant.</w:t>
+      </w:r>
+    </w:p>
+    <w:p>
+      <w:pPr>
+        <w:pStyle w:val="Heading3"/>
+        <w:spacing w:before="240" w:after="160" w:line="360" w:lineRule="auto"/>
+        <w:jc w:val="left"/>
+      </w:pPr>
+      <w:r>
+        <w:rPr>
+          <w:rFonts w:ascii="Times New Roman" w:hAnsi="Times New Roman" w:eastAsia="Times New Roman"/>
+          <w:b/>
+          <w:i w:val="0"/>
+          <w:sz w:val="24"/>
+        </w:rPr>
+        <w:t>4.4.5 Sandbox et correction automatique</w:t>
+      </w:r>
+    </w:p>
+    <w:p>
+      <w:pPr>
+        <w:spacing w:after="160" w:line="360" w:lineRule="auto"/>
+        <w:ind w:firstLine="425"/>
+        <w:jc w:val="both"/>
+      </w:pPr>
+      <w:r>
+        <w:rPr>
+          <w:rFonts w:ascii="Times New Roman" w:hAnsi="Times New Roman" w:eastAsia="Times New Roman"/>
+          <w:b w:val="0"/>
+          <w:i w:val="0"/>
+          <w:sz w:val="24"/>
+        </w:rPr>
+        <w:t>Le service sandbox exécute le code Python dans un conteneur éphémère, avec timeout et sans accès réseau. En développement, un repli local peut exister si Docker est absent ; ce mode n'est pas recommandé pour une salle réelle. La correction automatique parcourt chaque test unitaire, exécute le programme, normalise la sortie, puis compare à la sortie attendue. Le poids de chaque test intervient dans le score automatique. Le professeur peut ensuite imposer un score manuel, qui prend le dessus lorsqu'il est renseigné.</w:t>
+      </w:r>
+    </w:p>
+    <w:p>
+      <w:pPr>
+        <w:pStyle w:val="Heading3"/>
+        <w:spacing w:before="240" w:after="160" w:line="360" w:lineRule="auto"/>
+        <w:jc w:val="left"/>
+      </w:pPr>
+      <w:r>
+        <w:rPr>
+          <w:rFonts w:ascii="Times New Roman" w:hAnsi="Times New Roman" w:eastAsia="Times New Roman"/>
+          <w:b/>
+          <w:i w:val="0"/>
+          <w:sz w:val="24"/>
+        </w:rPr>
+        <w:t>4.4.6 Landing page et contact</w:t>
+      </w:r>
+    </w:p>
+    <w:p>
+      <w:pPr>
+        <w:spacing w:after="160" w:line="360" w:lineRule="auto"/>
+        <w:ind w:firstLine="425"/>
+        <w:jc w:val="both"/>
+      </w:pPr>
+      <w:r>
+        <w:rPr>
+          <w:rFonts w:ascii="Times New Roman" w:hAnsi="Times New Roman" w:eastAsia="Times New Roman"/>
+          <w:b w:val="0"/>
+          <w:i w:val="0"/>
+          <w:sz w:val="24"/>
+        </w:rPr>
+        <w:t>La landing présente le produit. Le formulaire de contact appelle une API dédiée, enregistre une notification de type landing.contact et rend cette demande consultable côté Super Admin.</w:t>
       </w:r>
     </w:p>
     <w:p>
       <w:pPr>
         <w:pStyle w:val="Heading2"/>
-        <w:keepNext/>
-        <w:spacing w:before="200" w:after="200" w:line="360" w:lineRule="auto"/>
+        <w:spacing w:before="240" w:after="160" w:line="360" w:lineRule="auto"/>
         <w:jc w:val="left"/>
       </w:pPr>
       <w:r>
@@ -6223,29 +6648,61 @@
           <w:i w:val="0"/>
           <w:sz w:val="28"/>
         </w:rPr>
-        <w:t>4.4 Réalisation des modules principaux</w:t>
-      </w:r>
-    </w:p>
-    <w:p>
-      <w:pPr>
-        <w:spacing w:after="120" w:before="0" w:line="360" w:lineRule="auto"/>
+        <w:t>4.5 Points techniques difficiles</w:t>
+      </w:r>
+    </w:p>
+    <w:p>
+      <w:pPr>
+        <w:spacing w:after="160" w:line="360" w:lineRule="auto"/>
+        <w:ind w:firstLine="425"/>
+        <w:jc w:val="both"/>
+      </w:pPr>
+      <w:r>
+        <w:rPr>
+          <w:rFonts w:ascii="Times New Roman" w:hAnsi="Times New Roman" w:eastAsia="Times New Roman"/>
+          <w:b w:val="0"/>
+          <w:i w:val="0"/>
+          <w:sz w:val="24"/>
+        </w:rPr>
+        <w:t>Plusieurs problèmes concrets ont marqué la réalisation. Le cookie Secure en HTTP bloquait les connexions sur le réseau local ; il a fallu le conditionner à la présence réelle de HTTPS. Les objets Decimal de Prisma provoquaient un crash lorsqu'ils étaient passés directement à des composants clients ; la réponse a été de sérialiser les points en nombres côté serveur. Le timer étudiant ne suivait pas les changements de planning tant que la session n'était chargée qu'une seule fois ; un polling de synchronisation a réglé ce point. Le verrouillage trop strict des exercices empêchait toute modification d'un examen publié avant le démarrage ; la règle canModifyExamExercises a clarifié le comportement. Enfin, le passage d'icônes depuis des fichiers serveur vers des composants clients a exigé un mapping par chaînes côté client.</w:t>
+      </w:r>
+    </w:p>
+    <w:p>
+      <w:pPr>
+        <w:pStyle w:val="Heading2"/>
+        <w:spacing w:before="240" w:after="160" w:line="360" w:lineRule="auto"/>
         <w:jc w:val="left"/>
       </w:pPr>
       <w:r>
         <w:rPr>
           <w:rFonts w:ascii="Times New Roman" w:hAnsi="Times New Roman" w:eastAsia="Times New Roman"/>
+          <w:b/>
+          <w:i w:val="0"/>
+          <w:sz w:val="28"/>
+        </w:rPr>
+        <w:t>4.6 Déploiement</w:t>
+      </w:r>
+    </w:p>
+    <w:p>
+      <w:pPr>
+        <w:spacing w:after="160" w:line="360" w:lineRule="auto"/>
+        <w:ind w:firstLine="425"/>
+        <w:jc w:val="both"/>
+      </w:pPr>
+      <w:r>
+        <w:rPr>
+          <w:rFonts w:ascii="Times New Roman" w:hAnsi="Times New Roman" w:eastAsia="Times New Roman"/>
           <w:b w:val="0"/>
-          <w:i/>
+          <w:i w:val="0"/>
           <w:sz w:val="24"/>
         </w:rPr>
-        <w:t>[Contenu du point 4.4 à coller ici]</w:t>
+        <w:t>Pour une démonstration en salle, le scénario recommandé est simple : produire un build, démarrer avec next start en écoutant sur toutes les interfaces, puis accéder via http://adresse-de-l-hote:3000 depuis les postes étudiants. Il faut parfois ouvrir le port 3000 dans le pare-feu de la machine hôte. En production derrière HTTPS, le cookie Secure peut être activé normalement, avec ou sans FORCE_SECURE_COOKIES selon le proxy.</w:t>
       </w:r>
     </w:p>
     <w:p>
       <w:pPr>
         <w:pStyle w:val="Heading2"/>
-        <w:keepNext/>
-        <w:spacing w:before="200" w:after="200" w:line="360" w:lineRule="auto"/>
+        <w:spacing w:before="240" w:after="160" w:line="360" w:lineRule="auto"/>
         <w:jc w:val="left"/>
       </w:pPr>
       <w:r>
@@ -6255,91 +6712,23 @@
           <w:i w:val="0"/>
           <w:sz w:val="28"/>
         </w:rPr>
-        <w:t>4.5 Points techniques difficiles</w:t>
-      </w:r>
-    </w:p>
-    <w:p>
-      <w:pPr>
-        <w:spacing w:after="120" w:before="0" w:line="360" w:lineRule="auto"/>
-        <w:jc w:val="left"/>
+        <w:t>4.7 Conclusion partielle</w:t>
+      </w:r>
+    </w:p>
+    <w:p>
+      <w:pPr>
+        <w:spacing w:after="160" w:line="360" w:lineRule="auto"/>
+        <w:ind w:firstLine="425"/>
+        <w:jc w:val="both"/>
       </w:pPr>
       <w:r>
         <w:rPr>
           <w:rFonts w:ascii="Times New Roman" w:hAnsi="Times New Roman" w:eastAsia="Times New Roman"/>
           <w:b w:val="0"/>
-          <w:i/>
+          <w:i w:val="0"/>
           <w:sz w:val="24"/>
         </w:rPr>
-        <w:t>[Contenu du point 4.5 à coller ici]</w:t>
-      </w:r>
-    </w:p>
-    <w:p>
-      <w:pPr>
-        <w:pStyle w:val="Heading2"/>
-        <w:keepNext/>
-        <w:spacing w:before="200" w:after="200" w:line="360" w:lineRule="auto"/>
-        <w:jc w:val="left"/>
-      </w:pPr>
-      <w:r>
-        <w:rPr>
-          <w:rFonts w:ascii="Times New Roman" w:hAnsi="Times New Roman" w:eastAsia="Times New Roman"/>
-          <w:b/>
-          <w:i w:val="0"/>
-          <w:sz w:val="28"/>
-        </w:rPr>
-        <w:t>4.6 Déploiement</w:t>
-      </w:r>
-    </w:p>
-    <w:p>
-      <w:pPr>
-        <w:spacing w:after="120" w:before="0" w:line="360" w:lineRule="auto"/>
-        <w:jc w:val="left"/>
-      </w:pPr>
-      <w:r>
-        <w:rPr>
-          <w:rFonts w:ascii="Times New Roman" w:hAnsi="Times New Roman" w:eastAsia="Times New Roman"/>
-          <w:b w:val="0"/>
-          <w:i/>
-          <w:sz w:val="24"/>
-        </w:rPr>
-        <w:t>[Contenu du point 4.6 à coller ici]</w:t>
-      </w:r>
-    </w:p>
-    <w:p>
-      <w:pPr>
-        <w:pStyle w:val="Heading2"/>
-        <w:keepNext/>
-        <w:spacing w:before="200" w:after="200" w:line="360" w:lineRule="auto"/>
-        <w:jc w:val="left"/>
-      </w:pPr>
-      <w:r>
-        <w:rPr>
-          <w:rFonts w:ascii="Times New Roman" w:hAnsi="Times New Roman" w:eastAsia="Times New Roman"/>
-          <w:b/>
-          <w:i w:val="0"/>
-          <w:sz w:val="28"/>
-        </w:rPr>
-        <w:t>4.7 Conclusion partielle</w:t>
-      </w:r>
-    </w:p>
-    <w:p>
-      <w:pPr>
-        <w:spacing w:after="120" w:before="0" w:line="360" w:lineRule="auto"/>
-        <w:jc w:val="left"/>
-      </w:pPr>
-      <w:r>
-        <w:rPr>
-          <w:rFonts w:ascii="Times New Roman" w:hAnsi="Times New Roman" w:eastAsia="Times New Roman"/>
-          <w:b w:val="0"/>
-          <w:i/>
-          <w:sz w:val="24"/>
-        </w:rPr>
-        <w:t>[Contenu du point 4.7 à coller ici]</w:t>
-      </w:r>
-    </w:p>
-    <w:p>
-      <w:r>
-        <w:br w:type="page"/>
+        <w:t>Le MVP livre aujourd'hui une chaîne complète, suffisamment intégrée pour la démonstration et pour des usages pilotes. Les priorités d'ingénierie ont privilégié la fiabilité des parcours critiques (authentification, examen, contrôles de passation, correction, exports) plutôt qu'une infrastructure temps réel complète. Redis, les workers et le multi langage restent volontairement dans les perspectives.</w:t>
       </w:r>
     </w:p>
     <w:p>
@@ -6361,7 +6750,7 @@
     </w:p>
     <w:p>
       <w:pPr>
-        <w:spacing w:after="160" w:before="0" w:line="360" w:lineRule="auto"/>
+        <w:spacing w:after="160" w:line="360" w:lineRule="auto"/>
         <w:ind w:firstLine="425"/>
         <w:jc w:val="both"/>
       </w:pPr>
@@ -6372,14 +6761,13 @@
           <w:i w:val="0"/>
           <w:sz w:val="24"/>
         </w:rPr>
-        <w:t>Ce chapitre présente la stratégie de tests, les jeux de résultats, la discussion des apports observés, les limites résiduelles et les perspectives de poursuite.</w:t>
+        <w:t>Ce chapitre présente la campagne de validation du MVP, les résultats observés, les anomalies corrigées en cours de route, les limites assumées et les perspectives de poursuite.</w:t>
       </w:r>
     </w:p>
     <w:p>
       <w:pPr>
         <w:pStyle w:val="Heading2"/>
-        <w:keepNext/>
-        <w:spacing w:before="200" w:after="200" w:line="360" w:lineRule="auto"/>
+        <w:spacing w:before="240" w:after="160" w:line="360" w:lineRule="auto"/>
         <w:jc w:val="left"/>
       </w:pPr>
       <w:r>
@@ -6394,24 +6782,200 @@
     </w:p>
     <w:p>
       <w:pPr>
-        <w:spacing w:after="120" w:before="0" w:line="360" w:lineRule="auto"/>
+        <w:spacing w:after="160" w:line="360" w:lineRule="auto"/>
+        <w:ind w:firstLine="425"/>
+        <w:jc w:val="both"/>
+      </w:pPr>
+      <w:r>
+        <w:rPr>
+          <w:rFonts w:ascii="Times New Roman" w:hAnsi="Times New Roman" w:eastAsia="Times New Roman"/>
+          <w:b w:val="0"/>
+          <w:i w:val="0"/>
+          <w:sz w:val="24"/>
+        </w:rPr>
+        <w:t>La campagne cherchait à confirmer les exigences fonctionnelles critiques, à contrôler les règles métier, à vérifier la non régression technique via le build TypeScript, et à s'assurer du bon fonctionnement multi postes en HTTP local. Les tests unitaires automatisés exhaustifs n'ont pas été l'axe principal sous contrainte de temps. L'équipe a privilégié des scénarios bout en bout, plus représentatifs d'un livrable démontrable.</w:t>
+      </w:r>
+    </w:p>
+    <w:p>
+      <w:pPr>
+        <w:spacing w:after="160" w:line="360" w:lineRule="auto"/>
+        <w:ind w:firstLine="425"/>
+        <w:jc w:val="both"/>
+      </w:pPr>
+      <w:r>
+        <w:rPr>
+          <w:rFonts w:ascii="Times New Roman" w:hAnsi="Times New Roman" w:eastAsia="Times New Roman"/>
+          <w:b w:val="0"/>
+          <w:i w:val="0"/>
+          <w:sz w:val="24"/>
+        </w:rPr>
+        <w:t>La validation a donc combiné le build Next.js, des parcours manuels rôle par rôle, des essais de bornes sur les règles métier, des tests multi appareils sur le réseau local, et des vérifications après chaque correctif majeur (cookie Secure, Decimal, synchronisation du timer). Les jeux de données s'appuyaient sur un établissement de démonstration, des comptes types, des examens dans plusieurs états et des CSV volontairement valides ou invalides.</w:t>
+      </w:r>
+    </w:p>
+    <w:p>
+      <w:pPr>
+        <w:pStyle w:val="Heading2"/>
+        <w:spacing w:before="240" w:after="160" w:line="360" w:lineRule="auto"/>
         <w:jc w:val="left"/>
       </w:pPr>
       <w:r>
         <w:rPr>
           <w:rFonts w:ascii="Times New Roman" w:hAnsi="Times New Roman" w:eastAsia="Times New Roman"/>
+          <w:b/>
+          <w:i w:val="0"/>
+          <w:sz w:val="28"/>
+        </w:rPr>
+        <w:t>5.2 Jeux de tests et résultats</w:t>
+      </w:r>
+    </w:p>
+    <w:p>
+      <w:pPr>
+        <w:pStyle w:val="Heading3"/>
+        <w:spacing w:before="240" w:after="160" w:line="360" w:lineRule="auto"/>
+        <w:jc w:val="left"/>
+      </w:pPr>
+      <w:r>
+        <w:rPr>
+          <w:rFonts w:ascii="Times New Roman" w:hAnsi="Times New Roman" w:eastAsia="Times New Roman"/>
+          <w:b/>
+          <w:i w:val="0"/>
+          <w:sz w:val="24"/>
+        </w:rPr>
+        <w:t>Authentification et accès</w:t>
+      </w:r>
+    </w:p>
+    <w:p>
+      <w:pPr>
+        <w:spacing w:after="160" w:line="360" w:lineRule="auto"/>
+        <w:ind w:firstLine="425"/>
+        <w:jc w:val="both"/>
+      </w:pPr>
+      <w:r>
+        <w:rPr>
+          <w:rFonts w:ascii="Times New Roman" w:hAnsi="Times New Roman" w:eastAsia="Times New Roman"/>
           <w:b w:val="0"/>
-          <w:i/>
+          <w:i w:val="0"/>
           <w:sz w:val="24"/>
         </w:rPr>
-        <w:t>[Contenu du point 5.1 à coller ici]</w:t>
+        <w:t>Les essais de connexion montrent un comportement stable pour les différents rôles lorsque les identifiants sont corrects. Un mauvais mot de passe est rejeté. Un étudiant sans code d'examen ne peut pas démarrer le parcours d'épreuve. Le middleware empêche un rôle d'accéder aux espaces d'un autre. La déconnexion vide correctement le cookie. L'accès depuis un autre appareil en HTTP fonctionne après le correctif Secure.</w:t>
+      </w:r>
+    </w:p>
+    <w:p>
+      <w:pPr>
+        <w:pStyle w:val="Heading3"/>
+        <w:spacing w:before="240" w:after="160" w:line="360" w:lineRule="auto"/>
+        <w:jc w:val="left"/>
+      </w:pPr>
+      <w:r>
+        <w:rPr>
+          <w:rFonts w:ascii="Times New Roman" w:hAnsi="Times New Roman" w:eastAsia="Times New Roman"/>
+          <w:b/>
+          <w:i w:val="0"/>
+          <w:sz w:val="24"/>
+        </w:rPr>
+        <w:t>Administration</w:t>
+      </w:r>
+    </w:p>
+    <w:p>
+      <w:pPr>
+        <w:spacing w:after="160" w:line="360" w:lineRule="auto"/>
+        <w:ind w:firstLine="425"/>
+        <w:jc w:val="both"/>
+      </w:pPr>
+      <w:r>
+        <w:rPr>
+          <w:rFonts w:ascii="Times New Roman" w:hAnsi="Times New Roman" w:eastAsia="Times New Roman"/>
+          <w:b w:val="0"/>
+          <w:i w:val="0"/>
+          <w:sz w:val="24"/>
+        </w:rPr>
+        <w:t>La création de classes et d'étudiants manuels fonctionne, avec génération d'identifiants. L'import CSV crée les lignes valides et rejette clairement les classes inconnues ou les emails incorrects, en laissant un rapport exploitable. La limite de deux administrateurs actifs est respectée, tout comme l'interdiction de se désactiver soi-même. La promotion de rentrée met à jour les profils et l'année active. Le formulaire de contact de la landing enregistre une notification visible côté Super Admin.</w:t>
+      </w:r>
+    </w:p>
+    <w:p>
+      <w:pPr>
+        <w:pStyle w:val="Heading3"/>
+        <w:spacing w:before="240" w:after="160" w:line="360" w:lineRule="auto"/>
+        <w:jc w:val="left"/>
+      </w:pPr>
+      <w:r>
+        <w:rPr>
+          <w:rFonts w:ascii="Times New Roman" w:hAnsi="Times New Roman" w:eastAsia="Times New Roman"/>
+          <w:b/>
+          <w:i w:val="0"/>
+          <w:sz w:val="24"/>
+        </w:rPr>
+        <w:t>Examens côté professeur</w:t>
+      </w:r>
+    </w:p>
+    <w:p>
+      <w:pPr>
+        <w:spacing w:after="160" w:line="360" w:lineRule="auto"/>
+        <w:ind w:firstLine="425"/>
+        <w:jc w:val="both"/>
+      </w:pPr>
+      <w:r>
+        <w:rPr>
+          <w:rFonts w:ascii="Times New Roman" w:hAnsi="Times New Roman" w:eastAsia="Times New Roman"/>
+          <w:b w:val="0"/>
+          <w:i w:val="0"/>
+          <w:sz w:val="24"/>
+        </w:rPr>
+        <w:t>Un examen sans exercice ne peut pas être publié. Avec du contenu, la publication génère le code d'accès et permet le mode présentation. La duplication produit un nouveau brouillon complet. L'édition du planning sur un examen publié se répercute en salle d'attente et en composition. L'ajout d'exercices reste possible avant le démarrage et est refusé après. Le suivi live, les exports et l'ajustement manuel des notes se comportent conformément aux règles prévues.</w:t>
+      </w:r>
+    </w:p>
+    <w:p>
+      <w:pPr>
+        <w:pStyle w:val="Heading3"/>
+        <w:spacing w:before="240" w:after="160" w:line="360" w:lineRule="auto"/>
+        <w:jc w:val="left"/>
+      </w:pPr>
+      <w:r>
+        <w:rPr>
+          <w:rFonts w:ascii="Times New Roman" w:hAnsi="Times New Roman" w:eastAsia="Times New Roman"/>
+          <w:b/>
+          <w:i w:val="0"/>
+          <w:sz w:val="24"/>
+        </w:rPr>
+        <w:t>Parcours étudiant et contrôles de passation</w:t>
+      </w:r>
+    </w:p>
+    <w:p>
+      <w:pPr>
+        <w:spacing w:after="160" w:line="360" w:lineRule="auto"/>
+        <w:ind w:firstLine="425"/>
+        <w:jc w:val="both"/>
+      </w:pPr>
+      <w:r>
+        <w:rPr>
+          <w:rFonts w:ascii="Times New Roman" w:hAnsi="Times New Roman" w:eastAsia="Times New Roman"/>
+          <w:b w:val="0"/>
+          <w:i w:val="0"/>
+          <w:sz w:val="24"/>
+        </w:rPr>
+        <w:t>Un code d'examen invalide est refusé, avec protection contre les tentatives excessives. Sans plein écran, l'étudiant reste bloqué aux consignes. Au démarrage, la bascule vers la composition est automatique. L'exécution sandbox, l'autosave, la navigation entre exercices et la soumission manuelle ou automatique au timer fonctionnent. Les incidents de plein écran incrémentent un compteur et conduisent à l'exclusion au second incident. Le changement d'onglet est journalisé. Après soumission, la reconnexion est bloquée.</w:t>
+      </w:r>
+    </w:p>
+    <w:p>
+      <w:pPr>
+        <w:spacing w:after="160" w:line="360" w:lineRule="auto"/>
+        <w:ind w:firstLine="425"/>
+        <w:jc w:val="both"/>
+      </w:pPr>
+      <w:r>
+        <w:rPr>
+          <w:rFonts w:ascii="Times New Roman" w:hAnsi="Times New Roman" w:eastAsia="Times New Roman"/>
+          <w:b w:val="0"/>
+          <w:i w:val="0"/>
+          <w:sz w:val="24"/>
+        </w:rPr>
+        <w:t>Au total, la campagne manuelle ciblée a porté sur trente neuf cas critiques (authentification, administration, professeur, étudiant). Tous sont passés après les correctifs majeurs. Ce résultat doit être lu comme une validation fonctionnelle du périmètre MVP, et non comme une couverture automatisée exhaustive.</w:t>
       </w:r>
     </w:p>
     <w:p>
       <w:pPr>
         <w:pStyle w:val="Heading2"/>
-        <w:keepNext/>
-        <w:spacing w:before="200" w:after="200" w:line="360" w:lineRule="auto"/>
+        <w:spacing w:before="240" w:after="160" w:line="360" w:lineRule="auto"/>
         <w:jc w:val="left"/>
       </w:pPr>
       <w:r>
@@ -6421,29 +6985,77 @@
           <w:i w:val="0"/>
           <w:sz w:val="28"/>
         </w:rPr>
-        <w:t>5.2 Jeux de tests et résultats</w:t>
-      </w:r>
-    </w:p>
-    <w:p>
-      <w:pPr>
-        <w:spacing w:after="120" w:before="0" w:line="360" w:lineRule="auto"/>
+        <w:t>5.3 Discussion des résultats</w:t>
+      </w:r>
+    </w:p>
+    <w:p>
+      <w:pPr>
+        <w:spacing w:after="160" w:line="360" w:lineRule="auto"/>
+        <w:ind w:firstLine="425"/>
+        <w:jc w:val="both"/>
+      </w:pPr>
+      <w:r>
+        <w:rPr>
+          <w:rFonts w:ascii="Times New Roman" w:hAnsi="Times New Roman" w:eastAsia="Times New Roman"/>
+          <w:b w:val="0"/>
+          <w:i w:val="0"/>
+          <w:sz w:val="24"/>
+        </w:rPr>
+        <w:t>Le MVP permet aujourd'hui un parcours d'examen crédible, de la salle d'attente jusqu'à la soumission sous contraintes. La correction automatique des tests unitaires réduit le temps de traitement pour le professeur sans lui retirer le contrôle pédagogique. Les incidents horodatés, la présence numérique et le journal d'activité offrent une traçabilité utile. L'outil est exploitable en salle sur réseau local. L'administration scolaire et la présence produit (landing, contact, espaces par rôle) complètent un livrable démontrable de bout en bout.</w:t>
+      </w:r>
+    </w:p>
+    <w:p>
+      <w:pPr>
+        <w:spacing w:after="160" w:line="360" w:lineRule="auto"/>
+        <w:ind w:firstLine="425"/>
+        <w:jc w:val="both"/>
+      </w:pPr>
+      <w:r>
+        <w:rPr>
+          <w:rFonts w:ascii="Times New Roman" w:hAnsi="Times New Roman" w:eastAsia="Times New Roman"/>
+          <w:b w:val="0"/>
+          <w:i w:val="0"/>
+          <w:sz w:val="24"/>
+        </w:rPr>
+        <w:t>Trois anomalies ont particulièrement pesé avant d'être corrigées. Le cookie Secure bloquait toutes les connexions locales. Les props Decimal cassaient des composants clients. Le timer de composition n'évoluait pas après une modification professeur sans polling de synchronisation. Ces points confirment que la valeur du MVP tient autant aux parcours qu'à la robustesse des détails d'exécution en salle.</w:t>
+      </w:r>
+    </w:p>
+    <w:p>
+      <w:pPr>
+        <w:pStyle w:val="Heading2"/>
+        <w:spacing w:before="240" w:after="160" w:line="360" w:lineRule="auto"/>
         <w:jc w:val="left"/>
       </w:pPr>
       <w:r>
         <w:rPr>
           <w:rFonts w:ascii="Times New Roman" w:hAnsi="Times New Roman" w:eastAsia="Times New Roman"/>
+          <w:b/>
+          <w:i w:val="0"/>
+          <w:sz w:val="28"/>
+        </w:rPr>
+        <w:t>5.4 Limites et risques résiduels</w:t>
+      </w:r>
+    </w:p>
+    <w:p>
+      <w:pPr>
+        <w:spacing w:after="160" w:line="360" w:lineRule="auto"/>
+        <w:ind w:firstLine="425"/>
+        <w:jc w:val="both"/>
+      </w:pPr>
+      <w:r>
+        <w:rPr>
+          <w:rFonts w:ascii="Times New Roman" w:hAnsi="Times New Roman" w:eastAsia="Times New Roman"/>
           <w:b w:val="0"/>
-          <w:i/>
+          <w:i w:val="0"/>
           <w:sz w:val="24"/>
         </w:rPr>
-        <w:t>[Contenu du point 5.2 à coller ici]</w:t>
+        <w:t>La sécurité navigateur reste une dissuasion et une détection, non une isolation absolue de poste. Un second appareil, une capture d'écran externe ou une machine virtuelle hors contrôle ne sont pas bloqués techniquement. Le langage supporté est encore limité à Python. La sandbox dépend de Docker. Les workers et la file de correction ne sont pas industrialisés. Le temps réel repose sur du polling, acceptable pour des promotions modestes mais à revoir sous forte charge. L'activation par email, le paiement réel, une intégration Moodle profonde, certains raffinements QCM et une suite de tests bout en bout automatisés restent hors du livrable actuel ou partiels.</w:t>
       </w:r>
     </w:p>
     <w:p>
       <w:pPr>
         <w:pStyle w:val="Heading2"/>
-        <w:keepNext/>
-        <w:spacing w:before="200" w:after="200" w:line="360" w:lineRule="auto"/>
+        <w:spacing w:before="240" w:after="160" w:line="360" w:lineRule="auto"/>
         <w:jc w:val="left"/>
       </w:pPr>
       <w:r>
@@ -6453,123 +7065,71 @@
           <w:i w:val="0"/>
           <w:sz w:val="28"/>
         </w:rPr>
-        <w:t>5.3 Discussion des résultats</w:t>
-      </w:r>
-    </w:p>
-    <w:p>
-      <w:pPr>
-        <w:spacing w:after="120" w:before="0" w:line="360" w:lineRule="auto"/>
+        <w:t>5.5 Perspectives</w:t>
+      </w:r>
+    </w:p>
+    <w:p>
+      <w:pPr>
+        <w:spacing w:after="160" w:line="360" w:lineRule="auto"/>
+        <w:ind w:firstLine="425"/>
+        <w:jc w:val="both"/>
+      </w:pPr>
+      <w:r>
+        <w:rPr>
+          <w:rFonts w:ascii="Times New Roman" w:hAnsi="Times New Roman" w:eastAsia="Times New Roman"/>
+          <w:b w:val="0"/>
+          <w:i w:val="0"/>
+          <w:sz w:val="24"/>
+        </w:rPr>
+        <w:t>La feuille de route naturelle commence par l'élargissement des langages (Java, C, C++), l'activation des comptes par email et l'introduction de Redis avec un canal temps réel plus robuste. Les QCM avancés, la facturation réelle, une file de correction capable d'absorber des pics de soumissions, puis une API publique ou Moodle, constituent les étapes suivantes. Une interface dédiée au registre de salle pour les surveillants fermerait un chaînon encore humain. Toute surveillance vidéo, en revanche, devra d'abord trancher des questions éthiques et de protection des données avant d'être envisagée.</w:t>
+      </w:r>
+    </w:p>
+    <w:p>
+      <w:pPr>
+        <w:spacing w:after="160" w:line="360" w:lineRule="auto"/>
+        <w:ind w:firstLine="425"/>
+        <w:jc w:val="both"/>
+      </w:pPr>
+      <w:r>
+        <w:rPr>
+          <w:rFonts w:ascii="Times New Roman" w:hAnsi="Times New Roman" w:eastAsia="Times New Roman"/>
+          <w:b w:val="0"/>
+          <w:i w:val="0"/>
+          <w:sz w:val="24"/>
+        </w:rPr>
+        <w:t>Quatre recommandations pragmatiques ressortent pour la suite. D'abord, prioriser une suite bout en bout automatisée sur le trajet connexion, publication, composition et soumission. Ensuite, introduire Redis dès que le live doit dépasser quelques dizaines d'étudiants simultanés. Préparer ensuite une procédure salle simple (adresse, pare-feu, navigateurs supportés). Enfin, cadrer tôt le positionnement juridique avant toute dérive vers une surveillance intrusive.</w:t>
+      </w:r>
+    </w:p>
+    <w:p>
+      <w:pPr>
+        <w:pStyle w:val="Heading2"/>
+        <w:spacing w:before="240" w:after="160" w:line="360" w:lineRule="auto"/>
         <w:jc w:val="left"/>
       </w:pPr>
       <w:r>
         <w:rPr>
           <w:rFonts w:ascii="Times New Roman" w:hAnsi="Times New Roman" w:eastAsia="Times New Roman"/>
+          <w:b/>
+          <w:i w:val="0"/>
+          <w:sz w:val="28"/>
+        </w:rPr>
+        <w:t>5.6 Conclusion partielle</w:t>
+      </w:r>
+    </w:p>
+    <w:p>
+      <w:pPr>
+        <w:spacing w:after="160" w:line="360" w:lineRule="auto"/>
+        <w:ind w:firstLine="425"/>
+        <w:jc w:val="both"/>
+      </w:pPr>
+      <w:r>
+        <w:rPr>
+          <w:rFonts w:ascii="Times New Roman" w:hAnsi="Times New Roman" w:eastAsia="Times New Roman"/>
           <w:b w:val="0"/>
-          <w:i/>
+          <w:i w:val="0"/>
           <w:sz w:val="24"/>
         </w:rPr>
-        <w:t>[Contenu du point 5.3 à coller ici]</w:t>
-      </w:r>
-    </w:p>
-    <w:p>
-      <w:pPr>
-        <w:pStyle w:val="Heading2"/>
-        <w:keepNext/>
-        <w:spacing w:before="200" w:after="200" w:line="360" w:lineRule="auto"/>
-        <w:jc w:val="left"/>
-      </w:pPr>
-      <w:r>
-        <w:rPr>
-          <w:rFonts w:ascii="Times New Roman" w:hAnsi="Times New Roman" w:eastAsia="Times New Roman"/>
-          <w:b/>
-          <w:i w:val="0"/>
-          <w:sz w:val="28"/>
-        </w:rPr>
-        <w:t>5.4 Limites et risques résiduels</w:t>
-      </w:r>
-    </w:p>
-    <w:p>
-      <w:pPr>
-        <w:spacing w:after="120" w:before="0" w:line="360" w:lineRule="auto"/>
-        <w:jc w:val="left"/>
-      </w:pPr>
-      <w:r>
-        <w:rPr>
-          <w:rFonts w:ascii="Times New Roman" w:hAnsi="Times New Roman" w:eastAsia="Times New Roman"/>
-          <w:b w:val="0"/>
-          <w:i/>
-          <w:sz w:val="24"/>
-        </w:rPr>
-        <w:t>[Contenu du point 5.4 à coller ici]</w:t>
-      </w:r>
-    </w:p>
-    <w:p>
-      <w:pPr>
-        <w:pStyle w:val="Heading2"/>
-        <w:keepNext/>
-        <w:spacing w:before="200" w:after="200" w:line="360" w:lineRule="auto"/>
-        <w:jc w:val="left"/>
-      </w:pPr>
-      <w:r>
-        <w:rPr>
-          <w:rFonts w:ascii="Times New Roman" w:hAnsi="Times New Roman" w:eastAsia="Times New Roman"/>
-          <w:b/>
-          <w:i w:val="0"/>
-          <w:sz w:val="28"/>
-        </w:rPr>
-        <w:t>5.5 Perspectives</w:t>
-      </w:r>
-    </w:p>
-    <w:p>
-      <w:pPr>
-        <w:spacing w:after="120" w:before="0" w:line="360" w:lineRule="auto"/>
-        <w:jc w:val="left"/>
-      </w:pPr>
-      <w:r>
-        <w:rPr>
-          <w:rFonts w:ascii="Times New Roman" w:hAnsi="Times New Roman" w:eastAsia="Times New Roman"/>
-          <w:b w:val="0"/>
-          <w:i/>
-          <w:sz w:val="24"/>
-        </w:rPr>
-        <w:t>[Contenu du point 5.5 à coller ici]</w:t>
-      </w:r>
-    </w:p>
-    <w:p>
-      <w:pPr>
-        <w:pStyle w:val="Heading2"/>
-        <w:keepNext/>
-        <w:spacing w:before="200" w:after="200" w:line="360" w:lineRule="auto"/>
-        <w:jc w:val="left"/>
-      </w:pPr>
-      <w:r>
-        <w:rPr>
-          <w:rFonts w:ascii="Times New Roman" w:hAnsi="Times New Roman" w:eastAsia="Times New Roman"/>
-          <w:b/>
-          <w:i w:val="0"/>
-          <w:sz w:val="28"/>
-        </w:rPr>
-        <w:t>5.6 Conclusion partielle</w:t>
-      </w:r>
-    </w:p>
-    <w:p>
-      <w:pPr>
-        <w:spacing w:after="120" w:before="0" w:line="360" w:lineRule="auto"/>
-        <w:jc w:val="left"/>
-      </w:pPr>
-      <w:r>
-        <w:rPr>
-          <w:rFonts w:ascii="Times New Roman" w:hAnsi="Times New Roman" w:eastAsia="Times New Roman"/>
-          <w:b w:val="0"/>
-          <w:i/>
-          <w:sz w:val="24"/>
-        </w:rPr>
-        <w:t>[Contenu du point 5.6 à coller ici]</w:t>
-      </w:r>
-    </w:p>
-    <w:p>
-      <w:r>
-        <w:br w:type="page"/>
+        <w:t>La validation confirme que le MVP Cylentic est fonctionnellement démontrable et techniquement cohérent sur son périmètre. Les limites restantes relèvent surtout d'arbitrages de priorité (infrastructure temps réel, multi langages, automatisation des tests), et non d'un défaut d'architecture fondamental.</w:t>
       </w:r>
     </w:p>
     <w:p>
@@ -6591,7 +7151,7 @@
     </w:p>
     <w:p>
       <w:pPr>
-        <w:spacing w:after="160" w:before="0" w:line="360" w:lineRule="auto"/>
+        <w:spacing w:after="160" w:line="360" w:lineRule="auto"/>
         <w:ind w:firstLine="425"/>
         <w:jc w:val="both"/>
       </w:pPr>
@@ -6607,7 +7167,7 @@
     </w:p>
     <w:p>
       <w:pPr>
-        <w:spacing w:after="160" w:before="0" w:line="360" w:lineRule="auto"/>
+        <w:spacing w:after="160" w:line="360" w:lineRule="auto"/>
         <w:ind w:firstLine="425"/>
         <w:jc w:val="both"/>
       </w:pPr>
@@ -6618,12 +7178,12 @@
           <w:i w:val="0"/>
           <w:sz w:val="24"/>
         </w:rPr>
-        <w:t>La conception détaillée au chapitre 3 a permis de figer les rôles, les données et les flux avant d'entrer dans la réalisation. Le MVP vise l'essentiel plutôt que l'exhaustif. Des limites demeurent, notamment face à un second appareil non contrôlé et face à la montée en charge des exécutions simultanées. Ces limites, comme les perspectives de langages supplémentaires ou d'exports, seront précisées après les tests rapportés au chapitre 5.</w:t>
-      </w:r>
-    </w:p>
-    <w:p>
-      <w:pPr>
-        <w:spacing w:after="160" w:before="0" w:line="360" w:lineRule="auto"/>
+        <w:t>L'analyse des besoins a borné un MVP assumé. La conception UML a fixé les rôles, les données et les flux. La réalisation a ensuite livré une chaîne complète, de l'onboarding administrateur à la soumission étudiant, en passant par la publication, les contrôles de passation, la correction automatique et les exports. La campagne de validation a confirmé le comportement des parcours critiques après correction des anomalies de déploiement local, de sérialisation et de synchronisation du timer.</w:t>
+      </w:r>
+    </w:p>
+    <w:p>
+      <w:pPr>
+        <w:spacing w:after="160" w:line="360" w:lineRule="auto"/>
         <w:ind w:firstLine="425"/>
         <w:jc w:val="both"/>
       </w:pPr>
@@ -6634,12 +7194,7 @@
           <w:i w:val="0"/>
           <w:sz w:val="24"/>
         </w:rPr>
-        <w:t>Sur le plan méthodologique, le travail a conduit l'équipe à tenir ensemble analyse, modélisation et implémentation, sans perdre de vue le verdict d'un jury : comprendre le problème, montrer des choix justifiés, livrer un système utilisable dans son périmètre.</w:t>
-      </w:r>
-    </w:p>
-    <w:p>
-      <w:r>
-        <w:br w:type="page"/>
+        <w:t>Des limites demeurent, notamment face à un second appareil non contrôlé, face au multi langage et face à l'industrialisation du temps réel. Elles n'effacent pas le résultat principal : disposer d'un système utilisable dans son périmètre, justifié dans ses choix, et prêt pour des usages pilotes en salle. Sur le plan méthodologique, le travail a conduit l'équipe à tenir ensemble analyse, modélisation, implémentation et recette, sans perdre de vue le verdict d'un jury.</w:t>
       </w:r>
     </w:p>
     <w:p>

</xml_diff>